<commit_message>
fixed a typo in the group contract
</commit_message>
<xml_diff>
--- a/group_contract.docx
+++ b/group_contract.docx
@@ -1,12 +1,12 @@
 
 <file path=word/document.xml><?xml version="1.0" encoding="utf-8"?>
-<w:document xmlns:o="urn:schemas-microsoft-com:office:office" xmlns:r="http://schemas.openxmlformats.org/officeDocument/2006/relationships" xmlns:v="urn:schemas-microsoft-com:vml" xmlns:w="http://schemas.openxmlformats.org/wordprocessingml/2006/main" xmlns:w10="urn:schemas-microsoft-com:office:word" xmlns:wp="http://schemas.openxmlformats.org/drawingml/2006/wordprocessingDrawing" xmlns:pic="http://schemas.openxmlformats.org/drawingml/2006/picture" xmlns:wps="http://schemas.microsoft.com/office/word/2010/wordprocessingShape" xmlns:wpg="http://schemas.microsoft.com/office/word/2010/wordprocessingGroup" xmlns:mc="http://schemas.openxmlformats.org/markup-compatibility/2006" xmlns:wp14="http://schemas.microsoft.com/office/word/2010/wordprocessingDrawing" xmlns:w14="http://schemas.microsoft.com/office/word/2010/wordml" xmlns:w15="http://schemas.microsoft.com/office/word/2012/wordml" mc:Ignorable="w14 wp14 w15">
+<w:document xmlns:wpc="http://schemas.microsoft.com/office/word/2010/wordprocessingCanvas" xmlns:cx="http://schemas.microsoft.com/office/drawing/2014/chartex" xmlns:cx1="http://schemas.microsoft.com/office/drawing/2015/9/8/chartex" xmlns:cx2="http://schemas.microsoft.com/office/drawing/2015/10/21/chartex" xmlns:cx3="http://schemas.microsoft.com/office/drawing/2016/5/9/chartex" xmlns:cx4="http://schemas.microsoft.com/office/drawing/2016/5/10/chartex" xmlns:cx5="http://schemas.microsoft.com/office/drawing/2016/5/11/chartex" xmlns:cx6="http://schemas.microsoft.com/office/drawing/2016/5/12/chartex" xmlns:cx7="http://schemas.microsoft.com/office/drawing/2016/5/13/chartex" xmlns:cx8="http://schemas.microsoft.com/office/drawing/2016/5/14/chartex" xmlns:mc="http://schemas.openxmlformats.org/markup-compatibility/2006" xmlns:aink="http://schemas.microsoft.com/office/drawing/2016/ink" xmlns:am3d="http://schemas.microsoft.com/office/drawing/2017/model3d" xmlns:o="urn:schemas-microsoft-com:office:office" xmlns:oel="http://schemas.microsoft.com/office/2019/extlst" xmlns:r="http://schemas.openxmlformats.org/officeDocument/2006/relationships" xmlns:m="http://schemas.openxmlformats.org/officeDocument/2006/math" xmlns:v="urn:schemas-microsoft-com:vml" xmlns:wp14="http://schemas.microsoft.com/office/word/2010/wordprocessingDrawing" xmlns:wp="http://schemas.openxmlformats.org/drawingml/2006/wordprocessingDrawing" xmlns:w10="urn:schemas-microsoft-com:office:word" xmlns:w="http://schemas.openxmlformats.org/wordprocessingml/2006/main" xmlns:w14="http://schemas.microsoft.com/office/word/2010/wordml" xmlns:w15="http://schemas.microsoft.com/office/word/2012/wordml" xmlns:w16cex="http://schemas.microsoft.com/office/word/2018/wordml/cex" xmlns:w16cid="http://schemas.microsoft.com/office/word/2016/wordml/cid" xmlns:w16="http://schemas.microsoft.com/office/word/2018/wordml" xmlns:w16du="http://schemas.microsoft.com/office/word/2023/wordml/word16du" xmlns:w16sdtdh="http://schemas.microsoft.com/office/word/2020/wordml/sdtdatahash" xmlns:w16sdtfl="http://schemas.microsoft.com/office/word/2024/wordml/sdtformatlock" xmlns:w16se="http://schemas.microsoft.com/office/word/2015/wordml/symex" xmlns:wpg="http://schemas.microsoft.com/office/word/2010/wordprocessingGroup" xmlns:wpi="http://schemas.microsoft.com/office/word/2010/wordprocessingInk" xmlns:wne="http://schemas.microsoft.com/office/word/2006/wordml" xmlns:wps="http://schemas.microsoft.com/office/word/2010/wordprocessingShape" mc:Ignorable="w14 w15 w16se w16cid w16 w16cex w16sdtdh w16sdtfl w16du wp14">
   <w:body>
     <w:p>
       <w:pPr>
         <w:pStyle w:val="Title"/>
         <w:rPr>
-          <w:rFonts w:ascii="Liberation Serif" w:hAnsi="Liberation Serif"/>
+          <w:rFonts w:ascii="Liberation Serif" w:hAnsi="Liberation Serif" w:hint="eastAsia"/>
           <w:sz w:val="26"/>
           <w:szCs w:val="26"/>
         </w:rPr>
@@ -23,15 +23,10 @@
     <w:p>
       <w:pPr>
         <w:pStyle w:val="HorizontalLine"/>
-        <w:rPr/>
       </w:pPr>
-      <w:r>
-        <w:rPr/>
-      </w:r>
     </w:p>
     <w:p>
       <w:pPr>
-        <w:pStyle w:val="Normal"/>
         <w:rPr>
           <w:b/>
           <w:bCs/>
@@ -42,8 +37,6 @@
           <w:rFonts w:ascii="Liberation Serif" w:hAnsi="Liberation Serif"/>
           <w:b/>
           <w:bCs/>
-          <w:sz w:val="24"/>
-          <w:szCs w:val="24"/>
         </w:rPr>
         <w:t>1. Names &amp; Communication Details</w:t>
       </w:r>
@@ -51,35 +44,30 @@
     <w:tbl>
       <w:tblPr>
         <w:tblW w:w="5000" w:type="pct"/>
-        <w:jc w:val="left"/>
-        <w:tblInd w:w="0" w:type="dxa"/>
         <w:tblLayout w:type="fixed"/>
         <w:tblCellMar>
-          <w:top w:w="0" w:type="dxa"/>
           <w:left w:w="0" w:type="dxa"/>
-          <w:bottom w:w="0" w:type="dxa"/>
           <w:right w:w="0" w:type="dxa"/>
         </w:tblCellMar>
+        <w:tblLook w:val="04A0" w:firstRow="1" w:lastRow="0" w:firstColumn="1" w:lastColumn="0" w:noHBand="0" w:noVBand="1"/>
       </w:tblPr>
       <w:tblGrid>
-        <w:gridCol w:w="2256"/>
+        <w:gridCol w:w="2257"/>
         <w:gridCol w:w="2256"/>
         <w:gridCol w:w="2257"/>
         <w:gridCol w:w="2256"/>
       </w:tblGrid>
       <w:tr>
         <w:trPr>
-          <w:trHeight w:val="627" w:hRule="atLeast"/>
+          <w:trHeight w:val="627"/>
         </w:trPr>
         <w:tc>
           <w:tcPr>
             <w:tcW w:w="2256" w:type="dxa"/>
-            <w:tcBorders/>
-          </w:tcPr>
-          <w:p>
-            <w:pPr>
-              <w:pStyle w:val="TableContents"/>
-              <w:spacing w:before="0" w:after="160"/>
+          </w:tcPr>
+          <w:p>
+            <w:pPr>
+              <w:pStyle w:val="TableContents"/>
               <w:jc w:val="center"/>
               <w:rPr>
                 <w:b/>
@@ -103,15 +91,13 @@
         <w:tc>
           <w:tcPr>
             <w:tcW w:w="2256" w:type="dxa"/>
-            <w:tcBorders/>
-          </w:tcPr>
-          <w:p>
-            <w:pPr>
-              <w:pStyle w:val="TableContents"/>
-              <w:spacing w:before="0" w:after="160"/>
+          </w:tcPr>
+          <w:p>
+            <w:pPr>
+              <w:pStyle w:val="TableContents"/>
               <w:jc w:val="center"/>
               <w:rPr>
-                <w:rFonts w:ascii="Liberation Serif" w:hAnsi="Liberation Serif"/>
+                <w:rFonts w:ascii="Liberation Serif" w:hAnsi="Liberation Serif" w:hint="eastAsia"/>
                 <w:b/>
                 <w:bCs/>
                 <w:sz w:val="22"/>
@@ -133,12 +119,10 @@
         <w:tc>
           <w:tcPr>
             <w:tcW w:w="2257" w:type="dxa"/>
-            <w:tcBorders/>
-          </w:tcPr>
-          <w:p>
-            <w:pPr>
-              <w:pStyle w:val="TableContents"/>
-              <w:spacing w:before="0" w:after="160"/>
+          </w:tcPr>
+          <w:p>
+            <w:pPr>
+              <w:pStyle w:val="TableContents"/>
               <w:jc w:val="center"/>
               <w:rPr>
                 <w:b/>
@@ -162,12 +146,10 @@
         <w:tc>
           <w:tcPr>
             <w:tcW w:w="2256" w:type="dxa"/>
-            <w:tcBorders/>
-          </w:tcPr>
-          <w:p>
-            <w:pPr>
-              <w:pStyle w:val="TableContents"/>
-              <w:spacing w:before="0" w:after="160"/>
+          </w:tcPr>
+          <w:p>
+            <w:pPr>
+              <w:pStyle w:val="TableContents"/>
               <w:jc w:val="center"/>
               <w:rPr>
                 <w:b/>
@@ -190,16 +172,13 @@
         </w:tc>
       </w:tr>
       <w:tr>
-        <w:trPr/>
         <w:tc>
           <w:tcPr>
             <w:tcW w:w="2256" w:type="dxa"/>
-            <w:tcBorders/>
-          </w:tcPr>
-          <w:p>
-            <w:pPr>
-              <w:pStyle w:val="TableContents"/>
-              <w:spacing w:before="0" w:after="160"/>
+          </w:tcPr>
+          <w:p>
+            <w:pPr>
+              <w:pStyle w:val="TableContents"/>
               <w:rPr>
                 <w:sz w:val="22"/>
                 <w:szCs w:val="22"/>
@@ -218,12 +197,10 @@
         <w:tc>
           <w:tcPr>
             <w:tcW w:w="2256" w:type="dxa"/>
-            <w:tcBorders/>
-          </w:tcPr>
-          <w:p>
-            <w:pPr>
-              <w:pStyle w:val="TableContents"/>
-              <w:spacing w:before="0" w:after="160"/>
+          </w:tcPr>
+          <w:p>
+            <w:pPr>
+              <w:pStyle w:val="TableContents"/>
               <w:rPr>
                 <w:sz w:val="22"/>
                 <w:szCs w:val="22"/>
@@ -242,39 +219,27 @@
         <w:tc>
           <w:tcPr>
             <w:tcW w:w="2257" w:type="dxa"/>
-            <w:tcBorders/>
-          </w:tcPr>
-          <w:p>
-            <w:pPr>
-              <w:pStyle w:val="TableContents"/>
-              <w:spacing w:before="0" w:after="160"/>
-              <w:rPr>
-                <w:rFonts w:ascii="Liberation Serif" w:hAnsi="Liberation Serif"/>
-                <w:sz w:val="22"/>
-                <w:szCs w:val="22"/>
-              </w:rPr>
-            </w:pPr>
-            <w:r>
-              <w:rPr>
-                <w:rFonts w:ascii="Liberation Serif" w:hAnsi="Liberation Serif"/>
-                <w:sz w:val="22"/>
-                <w:szCs w:val="22"/>
-              </w:rPr>
-            </w:r>
+          </w:tcPr>
+          <w:p>
+            <w:pPr>
+              <w:pStyle w:val="TableContents"/>
+              <w:rPr>
+                <w:rFonts w:ascii="Liberation Serif" w:hAnsi="Liberation Serif" w:hint="eastAsia"/>
+                <w:sz w:val="22"/>
+                <w:szCs w:val="22"/>
+              </w:rPr>
+            </w:pPr>
           </w:p>
         </w:tc>
         <w:tc>
           <w:tcPr>
             <w:tcW w:w="2256" w:type="dxa"/>
-            <w:tcBorders/>
-          </w:tcPr>
-          <w:p>
-            <w:pPr>
-              <w:pStyle w:val="TableContents"/>
-              <w:spacing w:before="0" w:after="160"/>
-              <w:rPr>
-                <w:rFonts w:ascii="Liberation Serif" w:hAnsi="Liberation Serif"/>
-                <w:i/>
+          </w:tcPr>
+          <w:p>
+            <w:pPr>
+              <w:pStyle w:val="TableContents"/>
+              <w:rPr>
+                <w:rFonts w:ascii="Liberation Serif" w:hAnsi="Liberation Serif" w:hint="eastAsia"/>
                 <w:i/>
                 <w:iCs/>
                 <w:sz w:val="22"/>
@@ -295,16 +260,13 @@
         </w:tc>
       </w:tr>
       <w:tr>
-        <w:trPr/>
         <w:tc>
           <w:tcPr>
             <w:tcW w:w="2256" w:type="dxa"/>
-            <w:tcBorders/>
-          </w:tcPr>
-          <w:p>
-            <w:pPr>
-              <w:pStyle w:val="TableContents"/>
-              <w:spacing w:before="0" w:after="160"/>
+          </w:tcPr>
+          <w:p>
+            <w:pPr>
+              <w:pStyle w:val="TableContents"/>
               <w:rPr>
                 <w:sz w:val="22"/>
                 <w:szCs w:val="22"/>
@@ -323,12 +285,10 @@
         <w:tc>
           <w:tcPr>
             <w:tcW w:w="2256" w:type="dxa"/>
-            <w:tcBorders/>
-          </w:tcPr>
-          <w:p>
-            <w:pPr>
-              <w:pStyle w:val="TableContents"/>
-              <w:spacing w:before="0" w:after="160"/>
+          </w:tcPr>
+          <w:p>
+            <w:pPr>
+              <w:pStyle w:val="TableContents"/>
               <w:rPr>
                 <w:sz w:val="22"/>
                 <w:szCs w:val="22"/>
@@ -347,12 +307,10 @@
         <w:tc>
           <w:tcPr>
             <w:tcW w:w="2257" w:type="dxa"/>
-            <w:tcBorders/>
-          </w:tcPr>
-          <w:p>
-            <w:pPr>
-              <w:pStyle w:val="TableContents"/>
-              <w:spacing w:before="0" w:after="160"/>
+          </w:tcPr>
+          <w:p>
+            <w:pPr>
+              <w:pStyle w:val="TableContents"/>
               <w:rPr>
                 <w:sz w:val="22"/>
                 <w:szCs w:val="22"/>
@@ -371,15 +329,12 @@
         <w:tc>
           <w:tcPr>
             <w:tcW w:w="2256" w:type="dxa"/>
-            <w:tcBorders/>
-          </w:tcPr>
-          <w:p>
-            <w:pPr>
-              <w:pStyle w:val="TableContents"/>
-              <w:spacing w:before="0" w:after="160"/>
-              <w:rPr>
-                <w:rFonts w:ascii="Liberation Serif" w:hAnsi="Liberation Serif"/>
-                <w:i/>
+          </w:tcPr>
+          <w:p>
+            <w:pPr>
+              <w:pStyle w:val="TableContents"/>
+              <w:rPr>
+                <w:rFonts w:ascii="Liberation Serif" w:hAnsi="Liberation Serif" w:hint="eastAsia"/>
                 <w:i/>
                 <w:iCs/>
                 <w:sz w:val="22"/>
@@ -400,16 +355,13 @@
         </w:tc>
       </w:tr>
       <w:tr>
-        <w:trPr/>
         <w:tc>
           <w:tcPr>
             <w:tcW w:w="2256" w:type="dxa"/>
-            <w:tcBorders/>
-          </w:tcPr>
-          <w:p>
-            <w:pPr>
-              <w:pStyle w:val="TableContents"/>
-              <w:spacing w:before="0" w:after="160"/>
+          </w:tcPr>
+          <w:p>
+            <w:pPr>
+              <w:pStyle w:val="TableContents"/>
               <w:rPr>
                 <w:sz w:val="22"/>
                 <w:szCs w:val="22"/>
@@ -428,12 +380,10 @@
         <w:tc>
           <w:tcPr>
             <w:tcW w:w="2256" w:type="dxa"/>
-            <w:tcBorders/>
-          </w:tcPr>
-          <w:p>
-            <w:pPr>
-              <w:pStyle w:val="TableContents"/>
-              <w:spacing w:before="0" w:after="160"/>
+          </w:tcPr>
+          <w:p>
+            <w:pPr>
+              <w:pStyle w:val="TableContents"/>
               <w:rPr>
                 <w:sz w:val="22"/>
                 <w:szCs w:val="22"/>
@@ -452,39 +402,27 @@
         <w:tc>
           <w:tcPr>
             <w:tcW w:w="2257" w:type="dxa"/>
-            <w:tcBorders/>
-          </w:tcPr>
-          <w:p>
-            <w:pPr>
-              <w:pStyle w:val="TableContents"/>
-              <w:spacing w:before="0" w:after="160"/>
-              <w:rPr>
-                <w:rFonts w:ascii="Liberation Serif" w:hAnsi="Liberation Serif"/>
-                <w:sz w:val="22"/>
-                <w:szCs w:val="22"/>
-              </w:rPr>
-            </w:pPr>
-            <w:r>
-              <w:rPr>
-                <w:rFonts w:ascii="Liberation Serif" w:hAnsi="Liberation Serif"/>
-                <w:sz w:val="22"/>
-                <w:szCs w:val="22"/>
-              </w:rPr>
-            </w:r>
+          </w:tcPr>
+          <w:p>
+            <w:pPr>
+              <w:pStyle w:val="TableContents"/>
+              <w:rPr>
+                <w:rFonts w:ascii="Liberation Serif" w:hAnsi="Liberation Serif" w:hint="eastAsia"/>
+                <w:sz w:val="22"/>
+                <w:szCs w:val="22"/>
+              </w:rPr>
+            </w:pPr>
           </w:p>
         </w:tc>
         <w:tc>
           <w:tcPr>
             <w:tcW w:w="2256" w:type="dxa"/>
-            <w:tcBorders/>
-          </w:tcPr>
-          <w:p>
-            <w:pPr>
-              <w:pStyle w:val="TableContents"/>
-              <w:spacing w:before="0" w:after="160"/>
-              <w:rPr>
-                <w:rFonts w:ascii="Liberation Serif" w:hAnsi="Liberation Serif"/>
-                <w:i/>
+          </w:tcPr>
+          <w:p>
+            <w:pPr>
+              <w:pStyle w:val="TableContents"/>
+              <w:rPr>
+                <w:rFonts w:ascii="Liberation Serif" w:hAnsi="Liberation Serif" w:hint="eastAsia"/>
                 <w:i/>
                 <w:iCs/>
                 <w:sz w:val="22"/>
@@ -506,17 +444,15 @@
       </w:tr>
       <w:tr>
         <w:trPr>
-          <w:trHeight w:val="133" w:hRule="atLeast"/>
+          <w:trHeight w:val="133"/>
         </w:trPr>
         <w:tc>
           <w:tcPr>
             <w:tcW w:w="2256" w:type="dxa"/>
-            <w:tcBorders/>
-          </w:tcPr>
-          <w:p>
-            <w:pPr>
-              <w:pStyle w:val="TableContents"/>
-              <w:spacing w:before="0" w:after="160"/>
+          </w:tcPr>
+          <w:p>
+            <w:pPr>
+              <w:pStyle w:val="TableContents"/>
               <w:rPr>
                 <w:sz w:val="22"/>
                 <w:szCs w:val="22"/>
@@ -535,12 +471,10 @@
         <w:tc>
           <w:tcPr>
             <w:tcW w:w="2256" w:type="dxa"/>
-            <w:tcBorders/>
-          </w:tcPr>
-          <w:p>
-            <w:pPr>
-              <w:pStyle w:val="TableContents"/>
-              <w:spacing w:before="0" w:after="160"/>
+          </w:tcPr>
+          <w:p>
+            <w:pPr>
+              <w:pStyle w:val="TableContents"/>
               <w:rPr>
                 <w:sz w:val="22"/>
                 <w:szCs w:val="22"/>
@@ -559,39 +493,27 @@
         <w:tc>
           <w:tcPr>
             <w:tcW w:w="2257" w:type="dxa"/>
-            <w:tcBorders/>
-          </w:tcPr>
-          <w:p>
-            <w:pPr>
-              <w:pStyle w:val="TableContents"/>
-              <w:spacing w:before="0" w:after="160"/>
-              <w:rPr>
-                <w:rFonts w:ascii="Liberation Serif" w:hAnsi="Liberation Serif"/>
-                <w:sz w:val="22"/>
-                <w:szCs w:val="22"/>
-              </w:rPr>
-            </w:pPr>
-            <w:r>
-              <w:rPr>
-                <w:rFonts w:ascii="Liberation Serif" w:hAnsi="Liberation Serif"/>
-                <w:sz w:val="22"/>
-                <w:szCs w:val="22"/>
-              </w:rPr>
-            </w:r>
+          </w:tcPr>
+          <w:p>
+            <w:pPr>
+              <w:pStyle w:val="TableContents"/>
+              <w:rPr>
+                <w:rFonts w:ascii="Liberation Serif" w:hAnsi="Liberation Serif" w:hint="eastAsia"/>
+                <w:sz w:val="22"/>
+                <w:szCs w:val="22"/>
+              </w:rPr>
+            </w:pPr>
           </w:p>
         </w:tc>
         <w:tc>
           <w:tcPr>
             <w:tcW w:w="2256" w:type="dxa"/>
-            <w:tcBorders/>
-          </w:tcPr>
-          <w:p>
-            <w:pPr>
-              <w:pStyle w:val="TableContents"/>
-              <w:spacing w:before="0" w:after="160"/>
-              <w:rPr>
-                <w:rFonts w:ascii="Liberation Serif" w:hAnsi="Liberation Serif"/>
-                <w:i/>
+          </w:tcPr>
+          <w:p>
+            <w:pPr>
+              <w:pStyle w:val="TableContents"/>
+              <w:rPr>
+                <w:rFonts w:ascii="Liberation Serif" w:hAnsi="Liberation Serif" w:hint="eastAsia"/>
                 <w:i/>
                 <w:iCs/>
                 <w:sz w:val="22"/>
@@ -614,30 +536,17 @@
     </w:tbl>
     <w:p>
       <w:pPr>
-        <w:pStyle w:val="Normal"/>
         <w:rPr>
-          <w:rFonts w:ascii="Liberation Serif" w:hAnsi="Liberation Serif"/>
-          <w:sz w:val="24"/>
-          <w:szCs w:val="24"/>
+          <w:rFonts w:ascii="Liberation Serif" w:hAnsi="Liberation Serif" w:hint="eastAsia"/>
         </w:rPr>
       </w:pPr>
-      <w:r>
-        <w:rPr>
-          <w:rFonts w:ascii="Liberation Serif" w:hAnsi="Liberation Serif"/>
-          <w:sz w:val="24"/>
-          <w:szCs w:val="24"/>
-        </w:rPr>
-      </w:r>
     </w:p>
     <w:p>
       <w:pPr>
-        <w:pStyle w:val="Normal"/>
         <w:rPr>
-          <w:rFonts w:ascii="Liberation Serif" w:hAnsi="Liberation Serif"/>
+          <w:rFonts w:ascii="Liberation Serif" w:hAnsi="Liberation Serif" w:hint="eastAsia"/>
           <w:b/>
           <w:bCs/>
-          <w:sz w:val="24"/>
-          <w:szCs w:val="24"/>
         </w:rPr>
       </w:pPr>
       <w:r>
@@ -645,8 +554,6 @@
           <w:rFonts w:ascii="Liberation Serif" w:hAnsi="Liberation Serif"/>
           <w:b/>
           <w:bCs/>
-          <w:sz w:val="24"/>
-          <w:szCs w:val="24"/>
         </w:rPr>
         <w:t>2. Principles of Groupwork</w:t>
       </w:r>
@@ -654,34 +561,28 @@
     <w:tbl>
       <w:tblPr>
         <w:tblW w:w="5000" w:type="pct"/>
-        <w:jc w:val="left"/>
-        <w:tblInd w:w="0" w:type="dxa"/>
         <w:tblLayout w:type="fixed"/>
         <w:tblCellMar>
-          <w:top w:w="0" w:type="dxa"/>
           <w:left w:w="0" w:type="dxa"/>
-          <w:bottom w:w="0" w:type="dxa"/>
           <w:right w:w="0" w:type="dxa"/>
         </w:tblCellMar>
+        <w:tblLook w:val="04A0" w:firstRow="1" w:lastRow="0" w:firstColumn="1" w:lastColumn="0" w:noHBand="0" w:noVBand="1"/>
       </w:tblPr>
       <w:tblGrid>
         <w:gridCol w:w="2557"/>
-        <w:gridCol w:w="6468"/>
+        <w:gridCol w:w="6469"/>
       </w:tblGrid>
       <w:tr>
-        <w:trPr/>
         <w:tc>
           <w:tcPr>
             <w:tcW w:w="2557" w:type="dxa"/>
-            <w:tcBorders/>
-          </w:tcPr>
-          <w:p>
-            <w:pPr>
-              <w:pStyle w:val="TableContents"/>
-              <w:spacing w:before="0" w:after="160"/>
+          </w:tcPr>
+          <w:p>
+            <w:pPr>
+              <w:pStyle w:val="TableContents"/>
               <w:jc w:val="center"/>
               <w:rPr>
-                <w:rFonts w:ascii="Liberation Serif" w:hAnsi="Liberation Serif"/>
+                <w:rFonts w:ascii="Liberation Serif" w:hAnsi="Liberation Serif" w:hint="eastAsia"/>
                 <w:b/>
                 <w:bCs/>
                 <w:sz w:val="22"/>
@@ -703,15 +604,13 @@
         <w:tc>
           <w:tcPr>
             <w:tcW w:w="6468" w:type="dxa"/>
-            <w:tcBorders/>
-          </w:tcPr>
-          <w:p>
-            <w:pPr>
-              <w:pStyle w:val="TableContents"/>
-              <w:spacing w:before="0" w:after="160"/>
+          </w:tcPr>
+          <w:p>
+            <w:pPr>
+              <w:pStyle w:val="TableContents"/>
               <w:jc w:val="center"/>
               <w:rPr>
-                <w:rFonts w:ascii="Liberation Serif" w:hAnsi="Liberation Serif"/>
+                <w:rFonts w:ascii="Liberation Serif" w:hAnsi="Liberation Serif" w:hint="eastAsia"/>
                 <w:b/>
                 <w:bCs/>
                 <w:sz w:val="22"/>
@@ -732,18 +631,15 @@
         </w:tc>
       </w:tr>
       <w:tr>
-        <w:trPr/>
         <w:tc>
           <w:tcPr>
             <w:tcW w:w="2557" w:type="dxa"/>
-            <w:tcBorders/>
-          </w:tcPr>
-          <w:p>
-            <w:pPr>
-              <w:pStyle w:val="TableContents"/>
-              <w:spacing w:before="0" w:after="160"/>
-              <w:rPr>
-                <w:rFonts w:ascii="Liberation Serif" w:hAnsi="Liberation Serif"/>
+          </w:tcPr>
+          <w:p>
+            <w:pPr>
+              <w:pStyle w:val="TableContents"/>
+              <w:rPr>
+                <w:rFonts w:ascii="Liberation Serif" w:hAnsi="Liberation Serif" w:hint="eastAsia"/>
                 <w:sz w:val="22"/>
                 <w:szCs w:val="22"/>
               </w:rPr>
@@ -761,42 +657,53 @@
         <w:tc>
           <w:tcPr>
             <w:tcW w:w="6468" w:type="dxa"/>
-            <w:tcBorders/>
-          </w:tcPr>
-          <w:p>
-            <w:pPr>
-              <w:pStyle w:val="TableContents"/>
-              <w:spacing w:before="0" w:after="160"/>
-              <w:rPr>
-                <w:rFonts w:ascii="Liberation Serif" w:hAnsi="Liberation Serif"/>
-                <w:sz w:val="22"/>
-                <w:szCs w:val="22"/>
-              </w:rPr>
-            </w:pPr>
-            <w:r>
-              <w:rPr>
-                <w:rFonts w:ascii="Liberation Serif" w:hAnsi="Liberation Serif"/>
-                <w:sz w:val="22"/>
-                <w:szCs w:val="22"/>
-              </w:rPr>
-              <w:t>I agree to keep with lecture contents, but in the result that I am unable to attend, I will make it my personal responsibility to let my team know.</w:t>
+          </w:tcPr>
+          <w:p>
+            <w:pPr>
+              <w:pStyle w:val="TableContents"/>
+              <w:rPr>
+                <w:rFonts w:ascii="Liberation Serif" w:hAnsi="Liberation Serif" w:hint="eastAsia"/>
+                <w:sz w:val="22"/>
+                <w:szCs w:val="22"/>
+              </w:rPr>
+            </w:pPr>
+            <w:r>
+              <w:rPr>
+                <w:rFonts w:ascii="Liberation Serif" w:hAnsi="Liberation Serif"/>
+                <w:sz w:val="22"/>
+                <w:szCs w:val="22"/>
+              </w:rPr>
+              <w:t xml:space="preserve">I agree to keep </w:t>
+            </w:r>
+            <w:r>
+              <w:rPr>
+                <w:rFonts w:ascii="Liberation Serif" w:hAnsi="Liberation Serif"/>
+                <w:sz w:val="22"/>
+                <w:szCs w:val="22"/>
+              </w:rPr>
+              <w:t xml:space="preserve">up </w:t>
+            </w:r>
+            <w:r>
+              <w:rPr>
+                <w:rFonts w:ascii="Liberation Serif" w:hAnsi="Liberation Serif"/>
+                <w:sz w:val="22"/>
+                <w:szCs w:val="22"/>
+              </w:rPr>
+              <w:t>with lecture contents, but in the result that I am unable to attend, I will make it my personal responsibility to let my team know.</w:t>
             </w:r>
           </w:p>
         </w:tc>
       </w:tr>
       <w:tr>
-        <w:trPr/>
         <w:tc>
           <w:tcPr>
             <w:tcW w:w="2557" w:type="dxa"/>
-            <w:tcBorders/>
-          </w:tcPr>
-          <w:p>
-            <w:pPr>
-              <w:pStyle w:val="TableContents"/>
-              <w:spacing w:before="0" w:after="160"/>
-              <w:rPr>
-                <w:rFonts w:ascii="Liberation Serif" w:hAnsi="Liberation Serif"/>
+          </w:tcPr>
+          <w:p>
+            <w:pPr>
+              <w:pStyle w:val="TableContents"/>
+              <w:rPr>
+                <w:rFonts w:ascii="Liberation Serif" w:hAnsi="Liberation Serif" w:hint="eastAsia"/>
                 <w:sz w:val="22"/>
                 <w:szCs w:val="22"/>
               </w:rPr>
@@ -814,14 +721,12 @@
         <w:tc>
           <w:tcPr>
             <w:tcW w:w="6468" w:type="dxa"/>
-            <w:tcBorders/>
-          </w:tcPr>
-          <w:p>
-            <w:pPr>
-              <w:pStyle w:val="TableContents"/>
-              <w:spacing w:before="0" w:after="160"/>
-              <w:rPr>
-                <w:rFonts w:ascii="Liberation Serif" w:hAnsi="Liberation Serif"/>
+          </w:tcPr>
+          <w:p>
+            <w:pPr>
+              <w:pStyle w:val="TableContents"/>
+              <w:rPr>
+                <w:rFonts w:ascii="Liberation Serif" w:hAnsi="Liberation Serif" w:hint="eastAsia"/>
                 <w:sz w:val="22"/>
                 <w:szCs w:val="22"/>
               </w:rPr>
@@ -838,18 +743,15 @@
         </w:tc>
       </w:tr>
       <w:tr>
-        <w:trPr/>
         <w:tc>
           <w:tcPr>
             <w:tcW w:w="2557" w:type="dxa"/>
-            <w:tcBorders/>
-          </w:tcPr>
-          <w:p>
-            <w:pPr>
-              <w:pStyle w:val="TableContents"/>
-              <w:spacing w:before="0" w:after="160"/>
-              <w:rPr>
-                <w:rFonts w:ascii="Liberation Serif" w:hAnsi="Liberation Serif"/>
+          </w:tcPr>
+          <w:p>
+            <w:pPr>
+              <w:pStyle w:val="TableContents"/>
+              <w:rPr>
+                <w:rFonts w:ascii="Liberation Serif" w:hAnsi="Liberation Serif" w:hint="eastAsia"/>
                 <w:sz w:val="22"/>
                 <w:szCs w:val="22"/>
               </w:rPr>
@@ -867,14 +769,12 @@
         <w:tc>
           <w:tcPr>
             <w:tcW w:w="6468" w:type="dxa"/>
-            <w:tcBorders/>
-          </w:tcPr>
-          <w:p>
-            <w:pPr>
-              <w:pStyle w:val="TableContents"/>
-              <w:spacing w:before="0" w:after="160"/>
-              <w:rPr>
-                <w:rFonts w:ascii="Liberation Serif" w:hAnsi="Liberation Serif"/>
+          </w:tcPr>
+          <w:p>
+            <w:pPr>
+              <w:pStyle w:val="TableContents"/>
+              <w:rPr>
+                <w:rFonts w:ascii="Liberation Serif" w:hAnsi="Liberation Serif" w:hint="eastAsia"/>
                 <w:sz w:val="22"/>
                 <w:szCs w:val="22"/>
               </w:rPr>
@@ -891,18 +791,15 @@
         </w:tc>
       </w:tr>
       <w:tr>
-        <w:trPr/>
         <w:tc>
           <w:tcPr>
             <w:tcW w:w="2557" w:type="dxa"/>
-            <w:tcBorders/>
-          </w:tcPr>
-          <w:p>
-            <w:pPr>
-              <w:pStyle w:val="TableContents"/>
-              <w:spacing w:before="0" w:after="160"/>
-              <w:rPr>
-                <w:rFonts w:ascii="Liberation Serif" w:hAnsi="Liberation Serif"/>
+          </w:tcPr>
+          <w:p>
+            <w:pPr>
+              <w:pStyle w:val="TableContents"/>
+              <w:rPr>
+                <w:rFonts w:ascii="Liberation Serif" w:hAnsi="Liberation Serif" w:hint="eastAsia"/>
                 <w:sz w:val="22"/>
                 <w:szCs w:val="22"/>
               </w:rPr>
@@ -920,14 +817,12 @@
         <w:tc>
           <w:tcPr>
             <w:tcW w:w="6468" w:type="dxa"/>
-            <w:tcBorders/>
-          </w:tcPr>
-          <w:p>
-            <w:pPr>
-              <w:pStyle w:val="TableContents"/>
-              <w:spacing w:before="0" w:after="160"/>
-              <w:rPr>
-                <w:rFonts w:ascii="Liberation Serif" w:hAnsi="Liberation Serif"/>
+          </w:tcPr>
+          <w:p>
+            <w:pPr>
+              <w:pStyle w:val="TableContents"/>
+              <w:rPr>
+                <w:rFonts w:ascii="Liberation Serif" w:hAnsi="Liberation Serif" w:hint="eastAsia"/>
                 <w:sz w:val="22"/>
                 <w:szCs w:val="22"/>
               </w:rPr>
@@ -944,18 +839,15 @@
         </w:tc>
       </w:tr>
       <w:tr>
-        <w:trPr/>
         <w:tc>
           <w:tcPr>
             <w:tcW w:w="2557" w:type="dxa"/>
-            <w:tcBorders/>
-          </w:tcPr>
-          <w:p>
-            <w:pPr>
-              <w:pStyle w:val="TableContents"/>
-              <w:spacing w:before="0" w:after="160"/>
-              <w:rPr>
-                <w:rFonts w:ascii="Liberation Serif" w:hAnsi="Liberation Serif"/>
+          </w:tcPr>
+          <w:p>
+            <w:pPr>
+              <w:pStyle w:val="TableContents"/>
+              <w:rPr>
+                <w:rFonts w:ascii="Liberation Serif" w:hAnsi="Liberation Serif" w:hint="eastAsia"/>
                 <w:sz w:val="22"/>
                 <w:szCs w:val="22"/>
               </w:rPr>
@@ -973,14 +865,12 @@
         <w:tc>
           <w:tcPr>
             <w:tcW w:w="6468" w:type="dxa"/>
-            <w:tcBorders/>
-          </w:tcPr>
-          <w:p>
-            <w:pPr>
-              <w:pStyle w:val="TableContents"/>
-              <w:spacing w:before="0" w:after="160"/>
-              <w:rPr>
-                <w:rFonts w:ascii="Liberation Serif" w:hAnsi="Liberation Serif"/>
+          </w:tcPr>
+          <w:p>
+            <w:pPr>
+              <w:pStyle w:val="TableContents"/>
+              <w:rPr>
+                <w:rFonts w:ascii="Liberation Serif" w:hAnsi="Liberation Serif" w:hint="eastAsia"/>
                 <w:sz w:val="22"/>
                 <w:szCs w:val="22"/>
               </w:rPr>
@@ -997,18 +887,15 @@
         </w:tc>
       </w:tr>
       <w:tr>
-        <w:trPr/>
         <w:tc>
           <w:tcPr>
             <w:tcW w:w="2557" w:type="dxa"/>
-            <w:tcBorders/>
-          </w:tcPr>
-          <w:p>
-            <w:pPr>
-              <w:pStyle w:val="TableContents"/>
-              <w:spacing w:before="0" w:after="160"/>
-              <w:rPr>
-                <w:rFonts w:ascii="Liberation Serif" w:hAnsi="Liberation Serif"/>
+          </w:tcPr>
+          <w:p>
+            <w:pPr>
+              <w:pStyle w:val="TableContents"/>
+              <w:rPr>
+                <w:rFonts w:ascii="Liberation Serif" w:hAnsi="Liberation Serif" w:hint="eastAsia"/>
                 <w:sz w:val="22"/>
                 <w:szCs w:val="22"/>
               </w:rPr>
@@ -1026,14 +913,12 @@
         <w:tc>
           <w:tcPr>
             <w:tcW w:w="6468" w:type="dxa"/>
-            <w:tcBorders/>
-          </w:tcPr>
-          <w:p>
-            <w:pPr>
-              <w:pStyle w:val="TableContents"/>
-              <w:spacing w:before="0" w:after="160"/>
-              <w:rPr>
-                <w:rFonts w:ascii="Liberation Serif" w:hAnsi="Liberation Serif"/>
+          </w:tcPr>
+          <w:p>
+            <w:pPr>
+              <w:pStyle w:val="TableContents"/>
+              <w:rPr>
+                <w:rFonts w:ascii="Liberation Serif" w:hAnsi="Liberation Serif" w:hint="eastAsia"/>
                 <w:sz w:val="22"/>
                 <w:szCs w:val="22"/>
               </w:rPr>
@@ -1052,30 +937,29 @@
     </w:tbl>
     <w:p>
       <w:pPr>
-        <w:pStyle w:val="Normal"/>
         <w:rPr>
-          <w:rFonts w:ascii="Liberation Serif" w:hAnsi="Liberation Serif"/>
-          <w:sz w:val="24"/>
-          <w:szCs w:val="24"/>
+          <w:rFonts w:ascii="Liberation Serif" w:hAnsi="Liberation Serif" w:hint="eastAsia"/>
+        </w:rPr>
+      </w:pPr>
+    </w:p>
+    <w:p>
+      <w:pPr>
+        <w:rPr>
+          <w:rFonts w:ascii="Liberation Serif" w:hAnsi="Liberation Serif" w:hint="eastAsia"/>
+          <w:b/>
+          <w:bCs/>
         </w:rPr>
       </w:pPr>
       <w:r>
-        <w:rPr>
-          <w:rFonts w:ascii="Liberation Serif" w:hAnsi="Liberation Serif"/>
-          <w:sz w:val="24"/>
-          <w:szCs w:val="24"/>
-        </w:rPr>
+        <w:br w:type="page"/>
       </w:r>
     </w:p>
     <w:p>
       <w:pPr>
-        <w:pStyle w:val="Normal"/>
         <w:rPr>
-          <w:rFonts w:ascii="Liberation Serif" w:hAnsi="Liberation Serif"/>
+          <w:rFonts w:ascii="Liberation Serif" w:hAnsi="Liberation Serif" w:hint="eastAsia"/>
           <w:b/>
           <w:bCs/>
-          <w:sz w:val="24"/>
-          <w:szCs w:val="24"/>
         </w:rPr>
       </w:pPr>
       <w:r>
@@ -1083,24 +967,550 @@
           <w:rFonts w:ascii="Liberation Serif" w:hAnsi="Liberation Serif"/>
           <w:b/>
           <w:bCs/>
-          <w:sz w:val="24"/>
-          <w:szCs w:val="24"/>
         </w:rPr>
+        <w:lastRenderedPageBreak/>
+        <w:t>3. Task Timeline</w:t>
       </w:r>
-      <w:r>
-        <w:br w:type="page"/>
-      </w:r>
+    </w:p>
+    <w:tbl>
+      <w:tblPr>
+        <w:tblW w:w="5000" w:type="pct"/>
+        <w:tblLayout w:type="fixed"/>
+        <w:tblCellMar>
+          <w:left w:w="0" w:type="dxa"/>
+          <w:right w:w="0" w:type="dxa"/>
+        </w:tblCellMar>
+        <w:tblLook w:val="04A0" w:firstRow="1" w:lastRow="0" w:firstColumn="1" w:lastColumn="0" w:noHBand="0" w:noVBand="1"/>
+      </w:tblPr>
+      <w:tblGrid>
+        <w:gridCol w:w="3195"/>
+        <w:gridCol w:w="3681"/>
+        <w:gridCol w:w="2150"/>
+      </w:tblGrid>
+      <w:tr>
+        <w:tc>
+          <w:tcPr>
+            <w:tcW w:w="2795" w:type="dxa"/>
+          </w:tcPr>
+          <w:p>
+            <w:pPr>
+              <w:pStyle w:val="TableContents"/>
+              <w:jc w:val="center"/>
+              <w:rPr>
+                <w:b/>
+                <w:bCs/>
+                <w:sz w:val="22"/>
+                <w:szCs w:val="22"/>
+              </w:rPr>
+            </w:pPr>
+            <w:r>
+              <w:rPr>
+                <w:rFonts w:ascii="Liberation Serif" w:hAnsi="Liberation Serif"/>
+                <w:b/>
+                <w:bCs/>
+                <w:sz w:val="22"/>
+                <w:szCs w:val="22"/>
+              </w:rPr>
+              <w:t>Tasks and Details</w:t>
+            </w:r>
+          </w:p>
+        </w:tc>
+        <w:tc>
+          <w:tcPr>
+            <w:tcW w:w="3221" w:type="dxa"/>
+          </w:tcPr>
+          <w:p>
+            <w:pPr>
+              <w:pStyle w:val="TableContents"/>
+              <w:jc w:val="center"/>
+              <w:rPr>
+                <w:b/>
+                <w:bCs/>
+                <w:sz w:val="22"/>
+                <w:szCs w:val="22"/>
+              </w:rPr>
+            </w:pPr>
+            <w:r>
+              <w:rPr>
+                <w:rFonts w:ascii="Liberation Serif" w:hAnsi="Liberation Serif"/>
+                <w:b/>
+                <w:bCs/>
+                <w:sz w:val="22"/>
+                <w:szCs w:val="22"/>
+              </w:rPr>
+              <w:t>Timeline for completion</w:t>
+            </w:r>
+          </w:p>
+        </w:tc>
+        <w:tc>
+          <w:tcPr>
+            <w:tcW w:w="1881" w:type="dxa"/>
+          </w:tcPr>
+          <w:p>
+            <w:pPr>
+              <w:pStyle w:val="TableContents"/>
+              <w:jc w:val="center"/>
+              <w:rPr>
+                <w:rFonts w:ascii="Liberation Serif" w:hAnsi="Liberation Serif" w:hint="eastAsia"/>
+                <w:b/>
+                <w:bCs/>
+                <w:sz w:val="22"/>
+                <w:szCs w:val="22"/>
+              </w:rPr>
+            </w:pPr>
+            <w:r>
+              <w:rPr>
+                <w:rFonts w:ascii="Liberation Serif" w:hAnsi="Liberation Serif"/>
+                <w:b/>
+                <w:bCs/>
+                <w:sz w:val="22"/>
+                <w:szCs w:val="22"/>
+              </w:rPr>
+              <w:t>Person Responsible</w:t>
+            </w:r>
+          </w:p>
+        </w:tc>
+      </w:tr>
+      <w:tr>
+        <w:trPr>
+          <w:trHeight w:val="564"/>
+        </w:trPr>
+        <w:tc>
+          <w:tcPr>
+            <w:tcW w:w="2795" w:type="dxa"/>
+          </w:tcPr>
+          <w:p>
+            <w:pPr>
+              <w:pStyle w:val="TableContents"/>
+              <w:rPr>
+                <w:sz w:val="22"/>
+                <w:szCs w:val="22"/>
+              </w:rPr>
+            </w:pPr>
+            <w:r>
+              <w:rPr>
+                <w:rFonts w:ascii="Liberation Serif" w:hAnsi="Liberation Serif"/>
+                <w:sz w:val="22"/>
+                <w:szCs w:val="22"/>
+              </w:rPr>
+              <w:t>Data Wrangling</w:t>
+            </w:r>
+          </w:p>
+        </w:tc>
+        <w:tc>
+          <w:tcPr>
+            <w:tcW w:w="3221" w:type="dxa"/>
+          </w:tcPr>
+          <w:p>
+            <w:pPr>
+              <w:pStyle w:val="TableContents"/>
+              <w:rPr>
+                <w:rFonts w:ascii="Liberation Serif" w:hAnsi="Liberation Serif" w:hint="eastAsia"/>
+                <w:sz w:val="22"/>
+                <w:szCs w:val="22"/>
+              </w:rPr>
+            </w:pPr>
+            <w:r>
+              <w:rPr>
+                <w:rFonts w:ascii="Liberation Serif" w:hAnsi="Liberation Serif"/>
+                <w:sz w:val="22"/>
+                <w:szCs w:val="22"/>
+              </w:rPr>
+              <w:t>First week</w:t>
+            </w:r>
+          </w:p>
+        </w:tc>
+        <w:tc>
+          <w:tcPr>
+            <w:tcW w:w="1881" w:type="dxa"/>
+          </w:tcPr>
+          <w:p>
+            <w:pPr>
+              <w:pStyle w:val="TableContents"/>
+              <w:rPr>
+                <w:rFonts w:ascii="Liberation Serif" w:hAnsi="Liberation Serif" w:hint="eastAsia"/>
+                <w:sz w:val="22"/>
+                <w:szCs w:val="22"/>
+              </w:rPr>
+            </w:pPr>
+            <w:r>
+              <w:rPr>
+                <w:rFonts w:ascii="Liberation Serif" w:hAnsi="Liberation Serif"/>
+                <w:sz w:val="22"/>
+                <w:szCs w:val="22"/>
+              </w:rPr>
+              <w:t>All</w:t>
+            </w:r>
+          </w:p>
+        </w:tc>
+      </w:tr>
+      <w:tr>
+        <w:tc>
+          <w:tcPr>
+            <w:tcW w:w="2795" w:type="dxa"/>
+          </w:tcPr>
+          <w:p>
+            <w:pPr>
+              <w:pStyle w:val="TableContents"/>
+              <w:rPr>
+                <w:sz w:val="22"/>
+                <w:szCs w:val="22"/>
+              </w:rPr>
+            </w:pPr>
+            <w:r>
+              <w:rPr>
+                <w:rFonts w:ascii="Liberation Serif" w:hAnsi="Liberation Serif"/>
+                <w:sz w:val="22"/>
+                <w:szCs w:val="22"/>
+              </w:rPr>
+              <w:t>3 Models for Revenue</w:t>
+            </w:r>
+          </w:p>
+        </w:tc>
+        <w:tc>
+          <w:tcPr>
+            <w:tcW w:w="3221" w:type="dxa"/>
+          </w:tcPr>
+          <w:p>
+            <w:pPr>
+              <w:pStyle w:val="TableContents"/>
+              <w:rPr>
+                <w:rFonts w:ascii="Liberation Serif" w:hAnsi="Liberation Serif" w:hint="eastAsia"/>
+                <w:sz w:val="22"/>
+                <w:szCs w:val="22"/>
+              </w:rPr>
+            </w:pPr>
+            <w:r>
+              <w:rPr>
+                <w:rFonts w:ascii="Liberation Serif" w:hAnsi="Liberation Serif"/>
+                <w:sz w:val="22"/>
+                <w:szCs w:val="22"/>
+              </w:rPr>
+              <w:t>Second week</w:t>
+            </w:r>
+          </w:p>
+        </w:tc>
+        <w:tc>
+          <w:tcPr>
+            <w:tcW w:w="1881" w:type="dxa"/>
+          </w:tcPr>
+          <w:p>
+            <w:pPr>
+              <w:pStyle w:val="TableContents"/>
+              <w:rPr>
+                <w:rFonts w:ascii="Liberation Serif" w:hAnsi="Liberation Serif" w:hint="eastAsia"/>
+                <w:sz w:val="22"/>
+                <w:szCs w:val="22"/>
+              </w:rPr>
+            </w:pPr>
+            <w:r>
+              <w:rPr>
+                <w:rFonts w:ascii="Liberation Serif" w:hAnsi="Liberation Serif"/>
+                <w:sz w:val="22"/>
+                <w:szCs w:val="22"/>
+              </w:rPr>
+              <w:t>Emma, Lucy</w:t>
+            </w:r>
+          </w:p>
+        </w:tc>
+      </w:tr>
+      <w:tr>
+        <w:tc>
+          <w:tcPr>
+            <w:tcW w:w="2795" w:type="dxa"/>
+          </w:tcPr>
+          <w:p>
+            <w:pPr>
+              <w:pStyle w:val="TableContents"/>
+              <w:rPr>
+                <w:sz w:val="22"/>
+                <w:szCs w:val="22"/>
+              </w:rPr>
+            </w:pPr>
+            <w:r>
+              <w:rPr>
+                <w:rFonts w:ascii="Liberation Serif" w:hAnsi="Liberation Serif"/>
+                <w:sz w:val="22"/>
+                <w:szCs w:val="22"/>
+              </w:rPr>
+              <w:t>3 Models for Ride Demand</w:t>
+            </w:r>
+          </w:p>
+        </w:tc>
+        <w:tc>
+          <w:tcPr>
+            <w:tcW w:w="3221" w:type="dxa"/>
+          </w:tcPr>
+          <w:p>
+            <w:pPr>
+              <w:pStyle w:val="TableContents"/>
+              <w:rPr>
+                <w:rFonts w:ascii="Liberation Serif" w:hAnsi="Liberation Serif" w:hint="eastAsia"/>
+                <w:sz w:val="22"/>
+                <w:szCs w:val="22"/>
+              </w:rPr>
+            </w:pPr>
+            <w:r>
+              <w:rPr>
+                <w:rFonts w:ascii="Liberation Serif" w:hAnsi="Liberation Serif"/>
+                <w:sz w:val="22"/>
+                <w:szCs w:val="22"/>
+              </w:rPr>
+              <w:t>Second week</w:t>
+            </w:r>
+          </w:p>
+        </w:tc>
+        <w:tc>
+          <w:tcPr>
+            <w:tcW w:w="1881" w:type="dxa"/>
+          </w:tcPr>
+          <w:p>
+            <w:pPr>
+              <w:pStyle w:val="TableContents"/>
+              <w:rPr>
+                <w:rFonts w:ascii="Liberation Serif" w:hAnsi="Liberation Serif" w:hint="eastAsia"/>
+                <w:sz w:val="22"/>
+                <w:szCs w:val="22"/>
+              </w:rPr>
+            </w:pPr>
+            <w:r>
+              <w:rPr>
+                <w:rFonts w:ascii="Liberation Serif" w:hAnsi="Liberation Serif"/>
+                <w:sz w:val="22"/>
+                <w:szCs w:val="22"/>
+              </w:rPr>
+              <w:t>Bhaskar, Kimon</w:t>
+            </w:r>
+          </w:p>
+        </w:tc>
+      </w:tr>
+      <w:tr>
+        <w:tc>
+          <w:tcPr>
+            <w:tcW w:w="2795" w:type="dxa"/>
+          </w:tcPr>
+          <w:p>
+            <w:pPr>
+              <w:pStyle w:val="TableContents"/>
+              <w:rPr>
+                <w:rFonts w:ascii="Liberation Serif" w:hAnsi="Liberation Serif" w:hint="eastAsia"/>
+                <w:sz w:val="22"/>
+                <w:szCs w:val="22"/>
+              </w:rPr>
+            </w:pPr>
+            <w:r>
+              <w:rPr>
+                <w:rFonts w:ascii="Liberation Serif" w:hAnsi="Liberation Serif"/>
+                <w:sz w:val="22"/>
+                <w:szCs w:val="22"/>
+              </w:rPr>
+              <w:t>Write up of Revenue Section</w:t>
+            </w:r>
+          </w:p>
+        </w:tc>
+        <w:tc>
+          <w:tcPr>
+            <w:tcW w:w="3221" w:type="dxa"/>
+          </w:tcPr>
+          <w:p>
+            <w:pPr>
+              <w:pStyle w:val="TableContents"/>
+              <w:rPr>
+                <w:rFonts w:ascii="Liberation Serif" w:hAnsi="Liberation Serif" w:hint="eastAsia"/>
+                <w:sz w:val="22"/>
+                <w:szCs w:val="22"/>
+              </w:rPr>
+            </w:pPr>
+            <w:r>
+              <w:rPr>
+                <w:rFonts w:ascii="Liberation Serif" w:hAnsi="Liberation Serif"/>
+                <w:sz w:val="22"/>
+                <w:szCs w:val="22"/>
+              </w:rPr>
+              <w:t>Third week</w:t>
+            </w:r>
+          </w:p>
+        </w:tc>
+        <w:tc>
+          <w:tcPr>
+            <w:tcW w:w="1881" w:type="dxa"/>
+          </w:tcPr>
+          <w:p>
+            <w:pPr>
+              <w:pStyle w:val="TableContents"/>
+              <w:rPr>
+                <w:rFonts w:ascii="Liberation Serif" w:hAnsi="Liberation Serif" w:hint="eastAsia"/>
+                <w:sz w:val="22"/>
+                <w:szCs w:val="22"/>
+              </w:rPr>
+            </w:pPr>
+            <w:r>
+              <w:rPr>
+                <w:rFonts w:ascii="Liberation Serif" w:hAnsi="Liberation Serif"/>
+                <w:sz w:val="22"/>
+                <w:szCs w:val="22"/>
+              </w:rPr>
+              <w:t>Emma, Lucy</w:t>
+            </w:r>
+          </w:p>
+        </w:tc>
+      </w:tr>
+      <w:tr>
+        <w:tc>
+          <w:tcPr>
+            <w:tcW w:w="2795" w:type="dxa"/>
+          </w:tcPr>
+          <w:p>
+            <w:pPr>
+              <w:pStyle w:val="TableContents"/>
+              <w:rPr>
+                <w:rFonts w:ascii="Liberation Serif" w:hAnsi="Liberation Serif" w:hint="eastAsia"/>
+                <w:sz w:val="22"/>
+                <w:szCs w:val="22"/>
+              </w:rPr>
+            </w:pPr>
+            <w:r>
+              <w:rPr>
+                <w:rFonts w:ascii="Liberation Serif" w:hAnsi="Liberation Serif"/>
+                <w:sz w:val="22"/>
+                <w:szCs w:val="22"/>
+              </w:rPr>
+              <w:t>Write up of Ride Demand Section</w:t>
+            </w:r>
+          </w:p>
+        </w:tc>
+        <w:tc>
+          <w:tcPr>
+            <w:tcW w:w="3221" w:type="dxa"/>
+          </w:tcPr>
+          <w:p>
+            <w:pPr>
+              <w:pStyle w:val="TableContents"/>
+              <w:rPr>
+                <w:rFonts w:ascii="Liberation Serif" w:hAnsi="Liberation Serif" w:hint="eastAsia"/>
+                <w:sz w:val="22"/>
+                <w:szCs w:val="22"/>
+              </w:rPr>
+            </w:pPr>
+            <w:r>
+              <w:rPr>
+                <w:rFonts w:ascii="Liberation Serif" w:hAnsi="Liberation Serif"/>
+                <w:sz w:val="22"/>
+                <w:szCs w:val="22"/>
+              </w:rPr>
+              <w:t>Third week</w:t>
+            </w:r>
+          </w:p>
+        </w:tc>
+        <w:tc>
+          <w:tcPr>
+            <w:tcW w:w="1881" w:type="dxa"/>
+          </w:tcPr>
+          <w:p>
+            <w:pPr>
+              <w:pStyle w:val="TableContents"/>
+              <w:rPr>
+                <w:rFonts w:ascii="Liberation Serif" w:hAnsi="Liberation Serif" w:hint="eastAsia"/>
+                <w:sz w:val="22"/>
+                <w:szCs w:val="22"/>
+              </w:rPr>
+            </w:pPr>
+            <w:r>
+              <w:rPr>
+                <w:rFonts w:ascii="Liberation Serif" w:hAnsi="Liberation Serif"/>
+                <w:sz w:val="22"/>
+                <w:szCs w:val="22"/>
+              </w:rPr>
+              <w:t>Bhaskar, Kimon</w:t>
+            </w:r>
+          </w:p>
+        </w:tc>
+      </w:tr>
+      <w:tr>
+        <w:tc>
+          <w:tcPr>
+            <w:tcW w:w="2795" w:type="dxa"/>
+          </w:tcPr>
+          <w:p>
+            <w:pPr>
+              <w:pStyle w:val="TableContents"/>
+              <w:rPr>
+                <w:rFonts w:ascii="Liberation Serif" w:hAnsi="Liberation Serif" w:hint="eastAsia"/>
+                <w:sz w:val="22"/>
+                <w:szCs w:val="22"/>
+              </w:rPr>
+            </w:pPr>
+            <w:r>
+              <w:rPr>
+                <w:rFonts w:ascii="Liberation Serif" w:hAnsi="Liberation Serif"/>
+                <w:sz w:val="22"/>
+                <w:szCs w:val="22"/>
+              </w:rPr>
+              <w:t>Finalise report</w:t>
+            </w:r>
+          </w:p>
+        </w:tc>
+        <w:tc>
+          <w:tcPr>
+            <w:tcW w:w="3221" w:type="dxa"/>
+          </w:tcPr>
+          <w:p>
+            <w:pPr>
+              <w:pStyle w:val="TableContents"/>
+              <w:rPr>
+                <w:rFonts w:ascii="Liberation Serif" w:hAnsi="Liberation Serif" w:hint="eastAsia"/>
+                <w:sz w:val="22"/>
+                <w:szCs w:val="22"/>
+              </w:rPr>
+            </w:pPr>
+            <w:r>
+              <w:rPr>
+                <w:rFonts w:ascii="Liberation Serif" w:hAnsi="Liberation Serif"/>
+                <w:sz w:val="22"/>
+                <w:szCs w:val="22"/>
+              </w:rPr>
+              <w:t>End</w:t>
+            </w:r>
+          </w:p>
+        </w:tc>
+        <w:tc>
+          <w:tcPr>
+            <w:tcW w:w="1881" w:type="dxa"/>
+          </w:tcPr>
+          <w:p>
+            <w:pPr>
+              <w:pStyle w:val="TableContents"/>
+              <w:rPr>
+                <w:rFonts w:ascii="Liberation Serif" w:hAnsi="Liberation Serif" w:hint="eastAsia"/>
+                <w:sz w:val="22"/>
+                <w:szCs w:val="22"/>
+              </w:rPr>
+            </w:pPr>
+            <w:r>
+              <w:rPr>
+                <w:rFonts w:ascii="Liberation Serif" w:hAnsi="Liberation Serif"/>
+                <w:sz w:val="22"/>
+                <w:szCs w:val="22"/>
+              </w:rPr>
+              <w:t>All</w:t>
+            </w:r>
+          </w:p>
+        </w:tc>
+      </w:tr>
+    </w:tbl>
+    <w:p>
+      <w:pPr>
+        <w:rPr>
+          <w:rFonts w:ascii="Liberation Serif" w:hAnsi="Liberation Serif" w:hint="eastAsia"/>
+        </w:rPr>
+      </w:pPr>
     </w:p>
     <w:p>
       <w:pPr>
-        <w:pStyle w:val="Normal"/>
-        <w:spacing w:before="0" w:after="160"/>
         <w:rPr>
-          <w:rFonts w:ascii="Liberation Serif" w:hAnsi="Liberation Serif"/>
+          <w:rFonts w:ascii="Liberation Serif" w:hAnsi="Liberation Serif" w:hint="eastAsia"/>
           <w:b/>
           <w:bCs/>
-          <w:sz w:val="24"/>
-          <w:szCs w:val="24"/>
         </w:rPr>
       </w:pPr>
       <w:r>
@@ -1108,659 +1518,6 @@
           <w:rFonts w:ascii="Liberation Serif" w:hAnsi="Liberation Serif"/>
           <w:b/>
           <w:bCs/>
-          <w:sz w:val="24"/>
-          <w:szCs w:val="24"/>
-        </w:rPr>
-        <w:t>3. Task Timeline</w:t>
-      </w:r>
-    </w:p>
-    <w:tbl>
-      <w:tblPr>
-        <w:tblW w:w="5000" w:type="pct"/>
-        <w:jc w:val="left"/>
-        <w:tblInd w:w="0" w:type="dxa"/>
-        <w:tblLayout w:type="fixed"/>
-        <w:tblCellMar>
-          <w:top w:w="0" w:type="dxa"/>
-          <w:left w:w="0" w:type="dxa"/>
-          <w:bottom w:w="0" w:type="dxa"/>
-          <w:right w:w="0" w:type="dxa"/>
-        </w:tblCellMar>
-      </w:tblPr>
-      <w:tblGrid>
-        <w:gridCol w:w="2795"/>
-        <w:gridCol w:w="3221"/>
-        <w:gridCol w:w="1881"/>
-      </w:tblGrid>
-      <w:tr>
-        <w:trPr/>
-        <w:tc>
-          <w:tcPr>
-            <w:tcW w:w="2795" w:type="dxa"/>
-            <w:tcBorders/>
-          </w:tcPr>
-          <w:p>
-            <w:pPr>
-              <w:pStyle w:val="TableContents"/>
-              <w:spacing w:before="0" w:after="160"/>
-              <w:jc w:val="center"/>
-              <w:rPr>
-                <w:b/>
-                <w:bCs/>
-                <w:sz w:val="22"/>
-                <w:szCs w:val="22"/>
-              </w:rPr>
-            </w:pPr>
-            <w:r>
-              <w:rPr>
-                <w:rFonts w:ascii="Liberation Serif" w:hAnsi="Liberation Serif"/>
-                <w:b/>
-                <w:bCs/>
-                <w:sz w:val="22"/>
-                <w:szCs w:val="22"/>
-              </w:rPr>
-              <w:t>Tasks and Details</w:t>
-            </w:r>
-          </w:p>
-        </w:tc>
-        <w:tc>
-          <w:tcPr>
-            <w:tcW w:w="3221" w:type="dxa"/>
-            <w:tcBorders/>
-          </w:tcPr>
-          <w:p>
-            <w:pPr>
-              <w:pStyle w:val="TableContents"/>
-              <w:spacing w:before="0" w:after="160"/>
-              <w:jc w:val="center"/>
-              <w:rPr>
-                <w:b/>
-                <w:bCs/>
-                <w:sz w:val="22"/>
-                <w:szCs w:val="22"/>
-              </w:rPr>
-            </w:pPr>
-            <w:r>
-              <w:rPr>
-                <w:rFonts w:ascii="Liberation Serif" w:hAnsi="Liberation Serif"/>
-                <w:b/>
-                <w:bCs/>
-                <w:sz w:val="22"/>
-                <w:szCs w:val="22"/>
-              </w:rPr>
-              <w:t>Timeline for completion</w:t>
-            </w:r>
-          </w:p>
-        </w:tc>
-        <w:tc>
-          <w:tcPr>
-            <w:tcW w:w="1881" w:type="dxa"/>
-            <w:tcBorders/>
-          </w:tcPr>
-          <w:p>
-            <w:pPr>
-              <w:pStyle w:val="TableContents"/>
-              <w:spacing w:before="0" w:after="160"/>
-              <w:jc w:val="center"/>
-              <w:rPr>
-                <w:rFonts w:ascii="Liberation Serif" w:hAnsi="Liberation Serif"/>
-                <w:b/>
-                <w:bCs/>
-                <w:sz w:val="22"/>
-                <w:szCs w:val="22"/>
-              </w:rPr>
-            </w:pPr>
-            <w:r>
-              <w:rPr>
-                <w:rFonts w:ascii="Liberation Serif" w:hAnsi="Liberation Serif"/>
-                <w:b/>
-                <w:bCs/>
-                <w:sz w:val="22"/>
-                <w:szCs w:val="22"/>
-              </w:rPr>
-              <w:t>Person Responsible</w:t>
-            </w:r>
-          </w:p>
-        </w:tc>
-      </w:tr>
-      <w:tr>
-        <w:trPr>
-          <w:trHeight w:val="564" w:hRule="atLeast"/>
-        </w:trPr>
-        <w:tc>
-          <w:tcPr>
-            <w:tcW w:w="2795" w:type="dxa"/>
-            <w:tcBorders/>
-          </w:tcPr>
-          <w:p>
-            <w:pPr>
-              <w:pStyle w:val="TableContents"/>
-              <w:spacing w:before="0" w:after="160"/>
-              <w:rPr>
-                <w:sz w:val="22"/>
-                <w:szCs w:val="22"/>
-              </w:rPr>
-            </w:pPr>
-            <w:r>
-              <w:rPr>
-                <w:rFonts w:ascii="Liberation Serif" w:hAnsi="Liberation Serif"/>
-                <w:sz w:val="22"/>
-                <w:szCs w:val="22"/>
-              </w:rPr>
-              <w:t>Data Wrangling</w:t>
-            </w:r>
-          </w:p>
-        </w:tc>
-        <w:tc>
-          <w:tcPr>
-            <w:tcW w:w="3221" w:type="dxa"/>
-            <w:tcBorders/>
-          </w:tcPr>
-          <w:p>
-            <w:pPr>
-              <w:pStyle w:val="TableContents"/>
-              <w:spacing w:before="0" w:after="160"/>
-              <w:rPr>
-                <w:rFonts w:ascii="Liberation Serif" w:hAnsi="Liberation Serif"/>
-                <w:sz w:val="22"/>
-                <w:szCs w:val="22"/>
-              </w:rPr>
-            </w:pPr>
-            <w:r>
-              <w:rPr>
-                <w:rFonts w:ascii="Liberation Serif" w:hAnsi="Liberation Serif"/>
-                <w:sz w:val="22"/>
-                <w:szCs w:val="22"/>
-              </w:rPr>
-              <w:t>First week</w:t>
-            </w:r>
-          </w:p>
-        </w:tc>
-        <w:tc>
-          <w:tcPr>
-            <w:tcW w:w="1881" w:type="dxa"/>
-            <w:tcBorders/>
-          </w:tcPr>
-          <w:p>
-            <w:pPr>
-              <w:pStyle w:val="TableContents"/>
-              <w:spacing w:before="0" w:after="160"/>
-              <w:rPr>
-                <w:rFonts w:ascii="Liberation Serif" w:hAnsi="Liberation Serif"/>
-                <w:sz w:val="22"/>
-                <w:szCs w:val="22"/>
-              </w:rPr>
-            </w:pPr>
-            <w:r>
-              <w:rPr>
-                <w:rFonts w:ascii="Liberation Serif" w:hAnsi="Liberation Serif"/>
-                <w:sz w:val="22"/>
-                <w:szCs w:val="22"/>
-              </w:rPr>
-              <w:t>All</w:t>
-            </w:r>
-          </w:p>
-        </w:tc>
-      </w:tr>
-      <w:tr>
-        <w:trPr/>
-        <w:tc>
-          <w:tcPr>
-            <w:tcW w:w="2795" w:type="dxa"/>
-            <w:tcBorders/>
-          </w:tcPr>
-          <w:p>
-            <w:pPr>
-              <w:pStyle w:val="TableContents"/>
-              <w:spacing w:before="0" w:after="160"/>
-              <w:rPr>
-                <w:sz w:val="22"/>
-                <w:szCs w:val="22"/>
-              </w:rPr>
-            </w:pPr>
-            <w:r>
-              <w:rPr>
-                <w:rFonts w:ascii="Liberation Serif" w:hAnsi="Liberation Serif"/>
-                <w:sz w:val="22"/>
-                <w:szCs w:val="22"/>
-              </w:rPr>
-              <w:t xml:space="preserve">3 </w:t>
-            </w:r>
-            <w:r>
-              <w:rPr>
-                <w:rFonts w:ascii="Liberation Serif" w:hAnsi="Liberation Serif"/>
-                <w:sz w:val="22"/>
-                <w:szCs w:val="22"/>
-              </w:rPr>
-              <w:t>Model</w:t>
-            </w:r>
-            <w:r>
-              <w:rPr>
-                <w:rFonts w:ascii="Liberation Serif" w:hAnsi="Liberation Serif"/>
-                <w:sz w:val="22"/>
-                <w:szCs w:val="22"/>
-              </w:rPr>
-              <w:t>s</w:t>
-            </w:r>
-            <w:r>
-              <w:rPr>
-                <w:rFonts w:ascii="Liberation Serif" w:hAnsi="Liberation Serif"/>
-                <w:sz w:val="22"/>
-                <w:szCs w:val="22"/>
-              </w:rPr>
-              <w:t xml:space="preserve"> for Revenue</w:t>
-            </w:r>
-          </w:p>
-        </w:tc>
-        <w:tc>
-          <w:tcPr>
-            <w:tcW w:w="3221" w:type="dxa"/>
-            <w:tcBorders/>
-          </w:tcPr>
-          <w:p>
-            <w:pPr>
-              <w:pStyle w:val="TableContents"/>
-              <w:spacing w:before="0" w:after="160"/>
-              <w:rPr>
-                <w:rFonts w:ascii="Liberation Serif" w:hAnsi="Liberation Serif"/>
-                <w:sz w:val="22"/>
-                <w:szCs w:val="22"/>
-              </w:rPr>
-            </w:pPr>
-            <w:r>
-              <w:rPr>
-                <w:rFonts w:ascii="Liberation Serif" w:hAnsi="Liberation Serif"/>
-                <w:sz w:val="22"/>
-                <w:szCs w:val="22"/>
-              </w:rPr>
-              <w:t>Second week</w:t>
-            </w:r>
-          </w:p>
-        </w:tc>
-        <w:tc>
-          <w:tcPr>
-            <w:tcW w:w="1881" w:type="dxa"/>
-            <w:tcBorders/>
-          </w:tcPr>
-          <w:p>
-            <w:pPr>
-              <w:pStyle w:val="TableContents"/>
-              <w:spacing w:before="0" w:after="160"/>
-              <w:rPr>
-                <w:rFonts w:ascii="Liberation Serif" w:hAnsi="Liberation Serif"/>
-                <w:sz w:val="22"/>
-                <w:szCs w:val="22"/>
-              </w:rPr>
-            </w:pPr>
-            <w:r>
-              <w:rPr>
-                <w:rFonts w:ascii="Liberation Serif" w:hAnsi="Liberation Serif"/>
-                <w:sz w:val="22"/>
-                <w:szCs w:val="22"/>
-              </w:rPr>
-              <w:t>Emma, Lucy</w:t>
-            </w:r>
-          </w:p>
-        </w:tc>
-      </w:tr>
-      <w:tr>
-        <w:trPr/>
-        <w:tc>
-          <w:tcPr>
-            <w:tcW w:w="2795" w:type="dxa"/>
-            <w:tcBorders/>
-          </w:tcPr>
-          <w:p>
-            <w:pPr>
-              <w:pStyle w:val="TableContents"/>
-              <w:bidi w:val="0"/>
-              <w:spacing w:before="0" w:after="160"/>
-              <w:rPr>
-                <w:sz w:val="22"/>
-                <w:szCs w:val="22"/>
-              </w:rPr>
-            </w:pPr>
-            <w:r>
-              <w:rPr>
-                <w:rFonts w:ascii="Liberation Serif" w:hAnsi="Liberation Serif"/>
-                <w:sz w:val="22"/>
-                <w:szCs w:val="22"/>
-              </w:rPr>
-              <w:t>3 Models</w:t>
-            </w:r>
-            <w:r>
-              <w:rPr>
-                <w:rFonts w:ascii="Liberation Serif" w:hAnsi="Liberation Serif"/>
-                <w:sz w:val="22"/>
-                <w:szCs w:val="22"/>
-              </w:rPr>
-              <w:t xml:space="preserve"> for Ride Demand</w:t>
-            </w:r>
-          </w:p>
-        </w:tc>
-        <w:tc>
-          <w:tcPr>
-            <w:tcW w:w="3221" w:type="dxa"/>
-            <w:tcBorders/>
-          </w:tcPr>
-          <w:p>
-            <w:pPr>
-              <w:pStyle w:val="TableContents"/>
-              <w:spacing w:before="0" w:after="160"/>
-              <w:rPr>
-                <w:rFonts w:ascii="Liberation Serif" w:hAnsi="Liberation Serif"/>
-                <w:sz w:val="22"/>
-                <w:szCs w:val="22"/>
-              </w:rPr>
-            </w:pPr>
-            <w:r>
-              <w:rPr>
-                <w:rFonts w:ascii="Liberation Serif" w:hAnsi="Liberation Serif"/>
-                <w:sz w:val="22"/>
-                <w:szCs w:val="22"/>
-              </w:rPr>
-              <w:t>Second week</w:t>
-            </w:r>
-          </w:p>
-        </w:tc>
-        <w:tc>
-          <w:tcPr>
-            <w:tcW w:w="1881" w:type="dxa"/>
-            <w:tcBorders/>
-          </w:tcPr>
-          <w:p>
-            <w:pPr>
-              <w:pStyle w:val="TableContents"/>
-              <w:spacing w:before="0" w:after="160"/>
-              <w:rPr>
-                <w:rFonts w:ascii="Liberation Serif" w:hAnsi="Liberation Serif"/>
-                <w:sz w:val="22"/>
-                <w:szCs w:val="22"/>
-              </w:rPr>
-            </w:pPr>
-            <w:r>
-              <w:rPr>
-                <w:rFonts w:ascii="Liberation Serif" w:hAnsi="Liberation Serif"/>
-                <w:sz w:val="22"/>
-                <w:szCs w:val="22"/>
-              </w:rPr>
-              <w:t>Bhaskar, Kimon</w:t>
-            </w:r>
-          </w:p>
-        </w:tc>
-      </w:tr>
-      <w:tr>
-        <w:trPr/>
-        <w:tc>
-          <w:tcPr>
-            <w:tcW w:w="2795" w:type="dxa"/>
-            <w:tcBorders/>
-          </w:tcPr>
-          <w:p>
-            <w:pPr>
-              <w:pStyle w:val="TableContents"/>
-              <w:spacing w:before="0" w:after="160"/>
-              <w:rPr>
-                <w:rFonts w:ascii="Liberation Serif" w:hAnsi="Liberation Serif"/>
-                <w:sz w:val="22"/>
-                <w:szCs w:val="22"/>
-              </w:rPr>
-            </w:pPr>
-            <w:r>
-              <w:rPr>
-                <w:rFonts w:ascii="Liberation Serif" w:hAnsi="Liberation Serif"/>
-                <w:sz w:val="22"/>
-                <w:szCs w:val="22"/>
-              </w:rPr>
-              <w:t>Write up of Revenue Section</w:t>
-            </w:r>
-          </w:p>
-        </w:tc>
-        <w:tc>
-          <w:tcPr>
-            <w:tcW w:w="3221" w:type="dxa"/>
-            <w:tcBorders/>
-          </w:tcPr>
-          <w:p>
-            <w:pPr>
-              <w:pStyle w:val="TableContents"/>
-              <w:spacing w:before="0" w:after="160"/>
-              <w:rPr>
-                <w:rFonts w:ascii="Liberation Serif" w:hAnsi="Liberation Serif"/>
-                <w:sz w:val="22"/>
-                <w:szCs w:val="22"/>
-              </w:rPr>
-            </w:pPr>
-            <w:r>
-              <w:rPr>
-                <w:rFonts w:ascii="Liberation Serif" w:hAnsi="Liberation Serif"/>
-                <w:sz w:val="22"/>
-                <w:szCs w:val="22"/>
-              </w:rPr>
-              <w:t>Third week</w:t>
-            </w:r>
-          </w:p>
-        </w:tc>
-        <w:tc>
-          <w:tcPr>
-            <w:tcW w:w="1881" w:type="dxa"/>
-            <w:tcBorders/>
-          </w:tcPr>
-          <w:p>
-            <w:pPr>
-              <w:pStyle w:val="TableContents"/>
-              <w:spacing w:before="0" w:after="160"/>
-              <w:rPr>
-                <w:rFonts w:ascii="Liberation Serif" w:hAnsi="Liberation Serif"/>
-                <w:sz w:val="22"/>
-                <w:szCs w:val="22"/>
-              </w:rPr>
-            </w:pPr>
-            <w:r>
-              <w:rPr>
-                <w:rFonts w:ascii="Liberation Serif" w:hAnsi="Liberation Serif"/>
-                <w:sz w:val="22"/>
-                <w:szCs w:val="22"/>
-              </w:rPr>
-              <w:t>Emma, Lucy</w:t>
-            </w:r>
-          </w:p>
-        </w:tc>
-      </w:tr>
-      <w:tr>
-        <w:trPr/>
-        <w:tc>
-          <w:tcPr>
-            <w:tcW w:w="2795" w:type="dxa"/>
-            <w:tcBorders/>
-          </w:tcPr>
-          <w:p>
-            <w:pPr>
-              <w:pStyle w:val="TableContents"/>
-              <w:spacing w:before="0" w:after="160"/>
-              <w:rPr>
-                <w:rFonts w:ascii="Liberation Serif" w:hAnsi="Liberation Serif"/>
-                <w:sz w:val="22"/>
-                <w:szCs w:val="22"/>
-              </w:rPr>
-            </w:pPr>
-            <w:r>
-              <w:rPr>
-                <w:rFonts w:ascii="Liberation Serif" w:hAnsi="Liberation Serif"/>
-                <w:sz w:val="22"/>
-                <w:szCs w:val="22"/>
-              </w:rPr>
-              <w:t>Write up of Ride Demand Section</w:t>
-            </w:r>
-          </w:p>
-        </w:tc>
-        <w:tc>
-          <w:tcPr>
-            <w:tcW w:w="3221" w:type="dxa"/>
-            <w:tcBorders/>
-          </w:tcPr>
-          <w:p>
-            <w:pPr>
-              <w:pStyle w:val="TableContents"/>
-              <w:spacing w:before="0" w:after="160"/>
-              <w:rPr>
-                <w:rFonts w:ascii="Liberation Serif" w:hAnsi="Liberation Serif"/>
-                <w:sz w:val="22"/>
-                <w:szCs w:val="22"/>
-              </w:rPr>
-            </w:pPr>
-            <w:r>
-              <w:rPr>
-                <w:rFonts w:ascii="Liberation Serif" w:hAnsi="Liberation Serif"/>
-                <w:sz w:val="22"/>
-                <w:szCs w:val="22"/>
-              </w:rPr>
-              <w:t>Third week</w:t>
-            </w:r>
-          </w:p>
-        </w:tc>
-        <w:tc>
-          <w:tcPr>
-            <w:tcW w:w="1881" w:type="dxa"/>
-            <w:tcBorders/>
-          </w:tcPr>
-          <w:p>
-            <w:pPr>
-              <w:pStyle w:val="TableContents"/>
-              <w:spacing w:before="0" w:after="160"/>
-              <w:rPr>
-                <w:rFonts w:ascii="Liberation Serif" w:hAnsi="Liberation Serif"/>
-                <w:sz w:val="22"/>
-                <w:szCs w:val="22"/>
-              </w:rPr>
-            </w:pPr>
-            <w:r>
-              <w:rPr>
-                <w:rFonts w:ascii="Liberation Serif" w:hAnsi="Liberation Serif"/>
-                <w:sz w:val="22"/>
-                <w:szCs w:val="22"/>
-              </w:rPr>
-              <w:t>Bhaskar, Kimon</w:t>
-            </w:r>
-          </w:p>
-        </w:tc>
-      </w:tr>
-      <w:tr>
-        <w:trPr/>
-        <w:tc>
-          <w:tcPr>
-            <w:tcW w:w="2795" w:type="dxa"/>
-            <w:tcBorders/>
-          </w:tcPr>
-          <w:p>
-            <w:pPr>
-              <w:pStyle w:val="TableContents"/>
-              <w:spacing w:before="0" w:after="160"/>
-              <w:rPr>
-                <w:rFonts w:ascii="Liberation Serif" w:hAnsi="Liberation Serif"/>
-                <w:sz w:val="22"/>
-                <w:szCs w:val="22"/>
-              </w:rPr>
-            </w:pPr>
-            <w:r>
-              <w:rPr>
-                <w:rFonts w:ascii="Liberation Serif" w:hAnsi="Liberation Serif"/>
-                <w:sz w:val="22"/>
-                <w:szCs w:val="22"/>
-              </w:rPr>
-              <w:t>Finalise report</w:t>
-            </w:r>
-          </w:p>
-        </w:tc>
-        <w:tc>
-          <w:tcPr>
-            <w:tcW w:w="3221" w:type="dxa"/>
-            <w:tcBorders/>
-          </w:tcPr>
-          <w:p>
-            <w:pPr>
-              <w:pStyle w:val="TableContents"/>
-              <w:spacing w:before="0" w:after="160"/>
-              <w:rPr>
-                <w:rFonts w:ascii="Liberation Serif" w:hAnsi="Liberation Serif"/>
-                <w:sz w:val="22"/>
-                <w:szCs w:val="22"/>
-              </w:rPr>
-            </w:pPr>
-            <w:r>
-              <w:rPr>
-                <w:rFonts w:ascii="Liberation Serif" w:hAnsi="Liberation Serif"/>
-                <w:sz w:val="22"/>
-                <w:szCs w:val="22"/>
-              </w:rPr>
-              <w:t>End</w:t>
-            </w:r>
-          </w:p>
-        </w:tc>
-        <w:tc>
-          <w:tcPr>
-            <w:tcW w:w="1881" w:type="dxa"/>
-            <w:tcBorders/>
-          </w:tcPr>
-          <w:p>
-            <w:pPr>
-              <w:pStyle w:val="TableContents"/>
-              <w:spacing w:before="0" w:after="160"/>
-              <w:rPr>
-                <w:rFonts w:ascii="Liberation Serif" w:hAnsi="Liberation Serif"/>
-                <w:sz w:val="22"/>
-                <w:szCs w:val="22"/>
-              </w:rPr>
-            </w:pPr>
-            <w:r>
-              <w:rPr>
-                <w:rFonts w:ascii="Liberation Serif" w:hAnsi="Liberation Serif"/>
-                <w:sz w:val="22"/>
-                <w:szCs w:val="22"/>
-              </w:rPr>
-              <w:t>All</w:t>
-            </w:r>
-          </w:p>
-        </w:tc>
-      </w:tr>
-    </w:tbl>
-    <w:p>
-      <w:pPr>
-        <w:pStyle w:val="Normal"/>
-        <w:spacing w:before="0" w:after="160"/>
-        <w:rPr>
-          <w:rFonts w:ascii="Liberation Serif" w:hAnsi="Liberation Serif"/>
-          <w:sz w:val="24"/>
-          <w:szCs w:val="24"/>
-        </w:rPr>
-      </w:pPr>
-      <w:r>
-        <w:rPr>
-          <w:rFonts w:ascii="Liberation Serif" w:hAnsi="Liberation Serif"/>
-          <w:sz w:val="24"/>
-          <w:szCs w:val="24"/>
-        </w:rPr>
-      </w:r>
-    </w:p>
-    <w:p>
-      <w:pPr>
-        <w:pStyle w:val="Normal"/>
-        <w:spacing w:before="0" w:after="160"/>
-        <w:rPr>
-          <w:rFonts w:ascii="Liberation Serif" w:hAnsi="Liberation Serif"/>
-          <w:b/>
-          <w:bCs/>
-          <w:sz w:val="24"/>
-          <w:szCs w:val="24"/>
-        </w:rPr>
-      </w:pPr>
-      <w:r>
-        <w:rPr>
-          <w:rFonts w:ascii="Liberation Serif" w:hAnsi="Liberation Serif"/>
-          <w:b/>
-          <w:bCs/>
-          <w:sz w:val="24"/>
-          <w:szCs w:val="24"/>
         </w:rPr>
         <w:t>4. Proposed Meeting Schedule</w:t>
       </w:r>
@@ -1768,15 +1525,12 @@
     <w:tbl>
       <w:tblPr>
         <w:tblW w:w="5000" w:type="pct"/>
-        <w:jc w:val="left"/>
-        <w:tblInd w:w="0" w:type="dxa"/>
         <w:tblLayout w:type="fixed"/>
         <w:tblCellMar>
-          <w:top w:w="0" w:type="dxa"/>
           <w:left w:w="0" w:type="dxa"/>
-          <w:bottom w:w="0" w:type="dxa"/>
           <w:right w:w="0" w:type="dxa"/>
         </w:tblCellMar>
+        <w:tblLook w:val="04A0" w:firstRow="1" w:lastRow="0" w:firstColumn="1" w:lastColumn="0" w:noHBand="0" w:noVBand="1"/>
       </w:tblPr>
       <w:tblGrid>
         <w:gridCol w:w="3008"/>
@@ -1784,18 +1538,15 @@
         <w:gridCol w:w="3009"/>
       </w:tblGrid>
       <w:tr>
-        <w:trPr/>
         <w:tc>
           <w:tcPr>
             <w:tcW w:w="3008" w:type="dxa"/>
-            <w:tcBorders/>
-          </w:tcPr>
-          <w:p>
-            <w:pPr>
-              <w:pStyle w:val="TableContents"/>
-              <w:spacing w:before="0" w:after="160"/>
-              <w:rPr>
-                <w:rFonts w:ascii="Liberation Serif" w:hAnsi="Liberation Serif"/>
+          </w:tcPr>
+          <w:p>
+            <w:pPr>
+              <w:pStyle w:val="TableContents"/>
+              <w:rPr>
+                <w:rFonts w:ascii="Liberation Serif" w:hAnsi="Liberation Serif" w:hint="eastAsia"/>
                 <w:b/>
                 <w:bCs/>
                 <w:sz w:val="22"/>
@@ -1817,14 +1568,12 @@
         <w:tc>
           <w:tcPr>
             <w:tcW w:w="3009" w:type="dxa"/>
-            <w:tcBorders/>
-          </w:tcPr>
-          <w:p>
-            <w:pPr>
-              <w:pStyle w:val="TableContents"/>
-              <w:spacing w:before="0" w:after="160"/>
-              <w:rPr>
-                <w:rFonts w:ascii="Liberation Serif" w:hAnsi="Liberation Serif"/>
+          </w:tcPr>
+          <w:p>
+            <w:pPr>
+              <w:pStyle w:val="TableContents"/>
+              <w:rPr>
+                <w:rFonts w:ascii="Liberation Serif" w:hAnsi="Liberation Serif" w:hint="eastAsia"/>
                 <w:b/>
                 <w:bCs/>
                 <w:sz w:val="22"/>
@@ -1846,14 +1595,12 @@
         <w:tc>
           <w:tcPr>
             <w:tcW w:w="3009" w:type="dxa"/>
-            <w:tcBorders/>
-          </w:tcPr>
-          <w:p>
-            <w:pPr>
-              <w:pStyle w:val="TableContents"/>
-              <w:spacing w:before="0" w:after="160"/>
-              <w:rPr>
-                <w:rFonts w:ascii="Liberation Serif" w:hAnsi="Liberation Serif"/>
+          </w:tcPr>
+          <w:p>
+            <w:pPr>
+              <w:pStyle w:val="TableContents"/>
+              <w:rPr>
+                <w:rFonts w:ascii="Liberation Serif" w:hAnsi="Liberation Serif" w:hint="eastAsia"/>
                 <w:b/>
                 <w:bCs/>
                 <w:sz w:val="22"/>
@@ -1874,19 +1621,15 @@
         </w:tc>
       </w:tr>
       <w:tr>
-        <w:trPr/>
         <w:tc>
           <w:tcPr>
             <w:tcW w:w="3008" w:type="dxa"/>
-            <w:tcBorders/>
-          </w:tcPr>
-          <w:p>
-            <w:pPr>
-              <w:pStyle w:val="TableContents"/>
-              <w:bidi w:val="0"/>
-              <w:spacing w:before="0" w:after="160"/>
-              <w:rPr>
-                <w:rFonts w:ascii="Liberation Serif" w:hAnsi="Liberation Serif"/>
+          </w:tcPr>
+          <w:p>
+            <w:pPr>
+              <w:pStyle w:val="TableContents"/>
+              <w:rPr>
+                <w:rFonts w:ascii="Liberation Serif" w:hAnsi="Liberation Serif" w:hint="eastAsia"/>
                 <w:sz w:val="22"/>
                 <w:szCs w:val="22"/>
               </w:rPr>
@@ -1921,14 +1664,12 @@
         <w:tc>
           <w:tcPr>
             <w:tcW w:w="3009" w:type="dxa"/>
-            <w:tcBorders/>
-          </w:tcPr>
-          <w:p>
-            <w:pPr>
-              <w:pStyle w:val="TableContents"/>
-              <w:spacing w:before="0" w:after="160"/>
-              <w:rPr>
-                <w:rFonts w:ascii="Liberation Serif" w:hAnsi="Liberation Serif"/>
+          </w:tcPr>
+          <w:p>
+            <w:pPr>
+              <w:pStyle w:val="TableContents"/>
+              <w:rPr>
+                <w:rFonts w:ascii="Liberation Serif" w:hAnsi="Liberation Serif" w:hint="eastAsia"/>
                 <w:sz w:val="22"/>
                 <w:szCs w:val="22"/>
               </w:rPr>
@@ -1946,14 +1687,12 @@
         <w:tc>
           <w:tcPr>
             <w:tcW w:w="3009" w:type="dxa"/>
-            <w:tcBorders/>
-          </w:tcPr>
-          <w:p>
-            <w:pPr>
-              <w:pStyle w:val="TableContents"/>
-              <w:spacing w:before="0" w:after="160"/>
-              <w:rPr>
-                <w:rFonts w:ascii="Liberation Serif" w:hAnsi="Liberation Serif"/>
+          </w:tcPr>
+          <w:p>
+            <w:pPr>
+              <w:pStyle w:val="TableContents"/>
+              <w:rPr>
+                <w:rFonts w:ascii="Liberation Serif" w:hAnsi="Liberation Serif" w:hint="eastAsia"/>
                 <w:sz w:val="22"/>
                 <w:szCs w:val="22"/>
               </w:rPr>
@@ -1970,18 +1709,15 @@
         </w:tc>
       </w:tr>
       <w:tr>
-        <w:trPr/>
         <w:tc>
           <w:tcPr>
             <w:tcW w:w="3008" w:type="dxa"/>
-            <w:tcBorders/>
-          </w:tcPr>
-          <w:p>
-            <w:pPr>
-              <w:pStyle w:val="TableContents"/>
-              <w:spacing w:before="0" w:after="160"/>
-              <w:rPr>
-                <w:rFonts w:ascii="Liberation Serif" w:hAnsi="Liberation Serif"/>
+          </w:tcPr>
+          <w:p>
+            <w:pPr>
+              <w:pStyle w:val="TableContents"/>
+              <w:rPr>
+                <w:rFonts w:ascii="Liberation Serif" w:hAnsi="Liberation Serif" w:hint="eastAsia"/>
                 <w:sz w:val="22"/>
                 <w:szCs w:val="22"/>
               </w:rPr>
@@ -2016,14 +1752,12 @@
         <w:tc>
           <w:tcPr>
             <w:tcW w:w="3009" w:type="dxa"/>
-            <w:tcBorders/>
-          </w:tcPr>
-          <w:p>
-            <w:pPr>
-              <w:pStyle w:val="TableContents"/>
-              <w:spacing w:before="0" w:after="160"/>
-              <w:rPr>
-                <w:rFonts w:ascii="Liberation Serif" w:hAnsi="Liberation Serif"/>
+          </w:tcPr>
+          <w:p>
+            <w:pPr>
+              <w:pStyle w:val="TableContents"/>
+              <w:rPr>
+                <w:rFonts w:ascii="Liberation Serif" w:hAnsi="Liberation Serif" w:hint="eastAsia"/>
                 <w:sz w:val="22"/>
                 <w:szCs w:val="22"/>
               </w:rPr>
@@ -2041,14 +1775,12 @@
         <w:tc>
           <w:tcPr>
             <w:tcW w:w="3009" w:type="dxa"/>
-            <w:tcBorders/>
-          </w:tcPr>
-          <w:p>
-            <w:pPr>
-              <w:pStyle w:val="TableContents"/>
-              <w:spacing w:before="0" w:after="160"/>
-              <w:rPr>
-                <w:rFonts w:ascii="Liberation Serif" w:hAnsi="Liberation Serif"/>
+          </w:tcPr>
+          <w:p>
+            <w:pPr>
+              <w:pStyle w:val="TableContents"/>
+              <w:rPr>
+                <w:rFonts w:ascii="Liberation Serif" w:hAnsi="Liberation Serif" w:hint="eastAsia"/>
                 <w:sz w:val="22"/>
                 <w:szCs w:val="22"/>
               </w:rPr>
@@ -2065,18 +1797,15 @@
         </w:tc>
       </w:tr>
       <w:tr>
-        <w:trPr/>
         <w:tc>
           <w:tcPr>
             <w:tcW w:w="3008" w:type="dxa"/>
-            <w:tcBorders/>
-          </w:tcPr>
-          <w:p>
-            <w:pPr>
-              <w:pStyle w:val="TableContents"/>
-              <w:spacing w:before="0" w:after="160"/>
-              <w:rPr>
-                <w:rFonts w:ascii="Liberation Serif" w:hAnsi="Liberation Serif"/>
+          </w:tcPr>
+          <w:p>
+            <w:pPr>
+              <w:pStyle w:val="TableContents"/>
+              <w:rPr>
+                <w:rFonts w:ascii="Liberation Serif" w:hAnsi="Liberation Serif" w:hint="eastAsia"/>
                 <w:sz w:val="22"/>
                 <w:szCs w:val="22"/>
               </w:rPr>
@@ -2111,14 +1840,12 @@
         <w:tc>
           <w:tcPr>
             <w:tcW w:w="3009" w:type="dxa"/>
-            <w:tcBorders/>
-          </w:tcPr>
-          <w:p>
-            <w:pPr>
-              <w:pStyle w:val="TableContents"/>
-              <w:spacing w:before="0" w:after="160"/>
-              <w:rPr>
-                <w:rFonts w:ascii="Liberation Serif" w:hAnsi="Liberation Serif"/>
+          </w:tcPr>
+          <w:p>
+            <w:pPr>
+              <w:pStyle w:val="TableContents"/>
+              <w:rPr>
+                <w:rFonts w:ascii="Liberation Serif" w:hAnsi="Liberation Serif" w:hint="eastAsia"/>
                 <w:sz w:val="22"/>
                 <w:szCs w:val="22"/>
               </w:rPr>
@@ -2136,14 +1863,12 @@
         <w:tc>
           <w:tcPr>
             <w:tcW w:w="3009" w:type="dxa"/>
-            <w:tcBorders/>
-          </w:tcPr>
-          <w:p>
-            <w:pPr>
-              <w:pStyle w:val="TableContents"/>
-              <w:spacing w:before="0" w:after="160"/>
-              <w:rPr>
-                <w:rFonts w:ascii="Liberation Serif" w:hAnsi="Liberation Serif"/>
+          </w:tcPr>
+          <w:p>
+            <w:pPr>
+              <w:pStyle w:val="TableContents"/>
+              <w:rPr>
+                <w:rFonts w:ascii="Liberation Serif" w:hAnsi="Liberation Serif" w:hint="eastAsia"/>
                 <w:sz w:val="22"/>
                 <w:szCs w:val="22"/>
               </w:rPr>
@@ -2160,18 +1885,15 @@
         </w:tc>
       </w:tr>
       <w:tr>
-        <w:trPr/>
         <w:tc>
           <w:tcPr>
             <w:tcW w:w="3008" w:type="dxa"/>
-            <w:tcBorders/>
-          </w:tcPr>
-          <w:p>
-            <w:pPr>
-              <w:pStyle w:val="TableContents"/>
-              <w:spacing w:before="0" w:after="160"/>
-              <w:rPr>
-                <w:rFonts w:ascii="Liberation Serif" w:hAnsi="Liberation Serif"/>
+          </w:tcPr>
+          <w:p>
+            <w:pPr>
+              <w:pStyle w:val="TableContents"/>
+              <w:rPr>
+                <w:rFonts w:ascii="Liberation Serif" w:hAnsi="Liberation Serif" w:hint="eastAsia"/>
                 <w:sz w:val="22"/>
                 <w:szCs w:val="22"/>
               </w:rPr>
@@ -2206,14 +1928,12 @@
         <w:tc>
           <w:tcPr>
             <w:tcW w:w="3009" w:type="dxa"/>
-            <w:tcBorders/>
-          </w:tcPr>
-          <w:p>
-            <w:pPr>
-              <w:pStyle w:val="TableContents"/>
-              <w:spacing w:before="0" w:after="160"/>
-              <w:rPr>
-                <w:rFonts w:ascii="Liberation Serif" w:hAnsi="Liberation Serif"/>
+          </w:tcPr>
+          <w:p>
+            <w:pPr>
+              <w:pStyle w:val="TableContents"/>
+              <w:rPr>
+                <w:rFonts w:ascii="Liberation Serif" w:hAnsi="Liberation Serif" w:hint="eastAsia"/>
                 <w:sz w:val="22"/>
                 <w:szCs w:val="22"/>
               </w:rPr>
@@ -2231,14 +1951,12 @@
         <w:tc>
           <w:tcPr>
             <w:tcW w:w="3009" w:type="dxa"/>
-            <w:tcBorders/>
-          </w:tcPr>
-          <w:p>
-            <w:pPr>
-              <w:pStyle w:val="TableContents"/>
-              <w:spacing w:before="0" w:after="160"/>
-              <w:rPr>
-                <w:rFonts w:ascii="Liberation Serif" w:hAnsi="Liberation Serif"/>
+          </w:tcPr>
+          <w:p>
+            <w:pPr>
+              <w:pStyle w:val="TableContents"/>
+              <w:rPr>
+                <w:rFonts w:ascii="Liberation Serif" w:hAnsi="Liberation Serif" w:hint="eastAsia"/>
                 <w:sz w:val="22"/>
                 <w:szCs w:val="22"/>
               </w:rPr>
@@ -2257,45 +1975,28 @@
     </w:tbl>
     <w:p>
       <w:pPr>
-        <w:pStyle w:val="Normal"/>
-        <w:spacing w:before="0" w:after="160"/>
         <w:rPr>
-          <w:rFonts w:ascii="Liberation Serif" w:hAnsi="Liberation Serif"/>
-          <w:b w:val="false"/>
-          <w:bCs w:val="false"/>
-          <w:sz w:val="24"/>
-          <w:szCs w:val="24"/>
+          <w:rFonts w:ascii="Liberation Serif" w:hAnsi="Liberation Serif" w:hint="eastAsia"/>
         </w:rPr>
       </w:pPr>
-      <w:r>
-        <w:rPr>
-          <w:rFonts w:ascii="Liberation Serif" w:hAnsi="Liberation Serif"/>
-          <w:b w:val="false"/>
-          <w:bCs w:val="false"/>
-          <w:sz w:val="24"/>
-          <w:szCs w:val="24"/>
-        </w:rPr>
-      </w:r>
     </w:p>
     <w:sectPr>
-      <w:type w:val="nextPage"/>
       <w:pgSz w:w="11906" w:h="16838"/>
-      <w:pgMar w:left="1440" w:right="1440" w:gutter="0" w:header="0" w:top="1440" w:footer="0" w:bottom="1440"/>
-      <w:pgNumType w:fmt="decimal"/>
-      <w:formProt w:val="false"/>
-      <w:textDirection w:val="lrTb"/>
-      <w:docGrid w:type="default" w:linePitch="360" w:charSpace="0"/>
+      <w:pgMar w:top="1440" w:right="1440" w:bottom="1440" w:left="1440" w:header="0" w:footer="0" w:gutter="0"/>
+      <w:cols w:space="720"/>
+      <w:formProt w:val="0"/>
+      <w:docGrid w:linePitch="360"/>
     </w:sectPr>
   </w:body>
 </w:document>
 </file>
 
 <file path=word/styles.xml><?xml version="1.0" encoding="utf-8"?>
-<w:styles xmlns:w="http://schemas.openxmlformats.org/wordprocessingml/2006/main" xmlns:w14="http://schemas.microsoft.com/office/word/2010/wordml" xmlns:mc="http://schemas.openxmlformats.org/markup-compatibility/2006" mc:Ignorable="w14">
+<w:styles xmlns:mc="http://schemas.openxmlformats.org/markup-compatibility/2006" xmlns:r="http://schemas.openxmlformats.org/officeDocument/2006/relationships" xmlns:w="http://schemas.openxmlformats.org/wordprocessingml/2006/main" xmlns:w14="http://schemas.microsoft.com/office/word/2010/wordml" xmlns:w15="http://schemas.microsoft.com/office/word/2012/wordml" xmlns:w16cex="http://schemas.microsoft.com/office/word/2018/wordml/cex" xmlns:w16cid="http://schemas.microsoft.com/office/word/2016/wordml/cid" xmlns:w16="http://schemas.microsoft.com/office/word/2018/wordml" xmlns:w16du="http://schemas.microsoft.com/office/word/2023/wordml/word16du" xmlns:w16sdtdh="http://schemas.microsoft.com/office/word/2020/wordml/sdtdatahash" xmlns:w16sdtfl="http://schemas.microsoft.com/office/word/2024/wordml/sdtformatlock" xmlns:w16se="http://schemas.microsoft.com/office/word/2015/wordml/symex" mc:Ignorable="w14 w15 w16se w16cid w16 w16cex w16sdtdh w16sdtfl w16du">
   <w:docDefaults>
     <w:rPrDefault>
       <w:rPr>
-        <w:rFonts w:ascii="Aptos" w:hAnsi="Aptos" w:eastAsia="" w:cs="" w:asciiTheme="minorHAnsi" w:cstheme="minorBidi" w:eastAsiaTheme="minorEastAsia" w:hAnsiTheme="minorHAnsi"/>
+        <w:rFonts w:asciiTheme="minorHAnsi" w:eastAsiaTheme="minorEastAsia" w:hAnsiTheme="minorHAnsi" w:cstheme="minorBidi"/>
         <w:kern w:val="2"/>
         <w:sz w:val="24"/>
         <w:szCs w:val="24"/>
@@ -2305,21 +2006,21 @@
     </w:rPrDefault>
     <w:pPrDefault>
       <w:pPr>
-        <w:suppressAutoHyphens w:val="true"/>
+        <w:suppressAutoHyphens/>
       </w:pPr>
     </w:pPrDefault>
   </w:docDefaults>
   <w:latentStyles w:defLockedState="0" w:defUIPriority="99" w:defSemiHidden="0" w:defUnhideWhenUsed="0" w:defQFormat="0" w:count="376">
     <w:lsdException w:name="Normal" w:uiPriority="0" w:qFormat="1"/>
     <w:lsdException w:name="heading 1" w:uiPriority="9" w:qFormat="1"/>
-    <w:lsdException w:name="heading 2" w:uiPriority="9" w:semiHidden="1" w:unhideWhenUsed="1" w:qFormat="1"/>
-    <w:lsdException w:name="heading 3" w:uiPriority="9" w:semiHidden="1" w:unhideWhenUsed="1" w:qFormat="1"/>
-    <w:lsdException w:name="heading 4" w:uiPriority="9" w:semiHidden="1" w:unhideWhenUsed="1" w:qFormat="1"/>
-    <w:lsdException w:name="heading 5" w:uiPriority="9" w:semiHidden="1" w:unhideWhenUsed="1" w:qFormat="1"/>
-    <w:lsdException w:name="heading 6" w:uiPriority="9" w:semiHidden="1" w:unhideWhenUsed="1" w:qFormat="1"/>
-    <w:lsdException w:name="heading 7" w:uiPriority="9" w:semiHidden="1" w:unhideWhenUsed="1" w:qFormat="1"/>
-    <w:lsdException w:name="heading 8" w:uiPriority="9" w:semiHidden="1" w:unhideWhenUsed="1" w:qFormat="1"/>
-    <w:lsdException w:name="heading 9" w:uiPriority="9" w:semiHidden="1" w:unhideWhenUsed="1" w:qFormat="1"/>
+    <w:lsdException w:name="heading 2" w:semiHidden="1" w:uiPriority="9" w:unhideWhenUsed="1" w:qFormat="1"/>
+    <w:lsdException w:name="heading 3" w:semiHidden="1" w:uiPriority="9" w:unhideWhenUsed="1" w:qFormat="1"/>
+    <w:lsdException w:name="heading 4" w:semiHidden="1" w:uiPriority="9" w:unhideWhenUsed="1" w:qFormat="1"/>
+    <w:lsdException w:name="heading 5" w:semiHidden="1" w:uiPriority="9" w:unhideWhenUsed="1" w:qFormat="1"/>
+    <w:lsdException w:name="heading 6" w:semiHidden="1" w:uiPriority="9" w:unhideWhenUsed="1" w:qFormat="1"/>
+    <w:lsdException w:name="heading 7" w:semiHidden="1" w:uiPriority="9" w:unhideWhenUsed="1" w:qFormat="1"/>
+    <w:lsdException w:name="heading 8" w:semiHidden="1" w:uiPriority="9" w:unhideWhenUsed="1" w:qFormat="1"/>
+    <w:lsdException w:name="heading 9" w:semiHidden="1" w:uiPriority="9" w:unhideWhenUsed="1" w:qFormat="1"/>
     <w:lsdException w:name="index 1" w:semiHidden="1" w:unhideWhenUsed="1"/>
     <w:lsdException w:name="index 2" w:semiHidden="1" w:unhideWhenUsed="1"/>
     <w:lsdException w:name="index 3" w:semiHidden="1" w:unhideWhenUsed="1"/>
@@ -2329,22 +2030,22 @@
     <w:lsdException w:name="index 7" w:semiHidden="1" w:unhideWhenUsed="1"/>
     <w:lsdException w:name="index 8" w:semiHidden="1" w:unhideWhenUsed="1"/>
     <w:lsdException w:name="index 9" w:semiHidden="1" w:unhideWhenUsed="1"/>
-    <w:lsdException w:name="toc 1" w:uiPriority="39" w:semiHidden="1" w:unhideWhenUsed="1"/>
-    <w:lsdException w:name="toc 2" w:uiPriority="39" w:semiHidden="1" w:unhideWhenUsed="1"/>
-    <w:lsdException w:name="toc 3" w:uiPriority="39" w:semiHidden="1" w:unhideWhenUsed="1"/>
-    <w:lsdException w:name="toc 4" w:uiPriority="39" w:semiHidden="1" w:unhideWhenUsed="1"/>
-    <w:lsdException w:name="toc 5" w:uiPriority="39" w:semiHidden="1" w:unhideWhenUsed="1"/>
-    <w:lsdException w:name="toc 6" w:uiPriority="39" w:semiHidden="1" w:unhideWhenUsed="1"/>
-    <w:lsdException w:name="toc 7" w:uiPriority="39" w:semiHidden="1" w:unhideWhenUsed="1"/>
-    <w:lsdException w:name="toc 8" w:uiPriority="39" w:semiHidden="1" w:unhideWhenUsed="1"/>
-    <w:lsdException w:name="toc 9" w:uiPriority="39" w:semiHidden="1" w:unhideWhenUsed="1"/>
+    <w:lsdException w:name="toc 1" w:semiHidden="1" w:uiPriority="39" w:unhideWhenUsed="1"/>
+    <w:lsdException w:name="toc 2" w:semiHidden="1" w:uiPriority="39" w:unhideWhenUsed="1"/>
+    <w:lsdException w:name="toc 3" w:semiHidden="1" w:uiPriority="39" w:unhideWhenUsed="1"/>
+    <w:lsdException w:name="toc 4" w:semiHidden="1" w:uiPriority="39" w:unhideWhenUsed="1"/>
+    <w:lsdException w:name="toc 5" w:semiHidden="1" w:uiPriority="39" w:unhideWhenUsed="1"/>
+    <w:lsdException w:name="toc 6" w:semiHidden="1" w:uiPriority="39" w:unhideWhenUsed="1"/>
+    <w:lsdException w:name="toc 7" w:semiHidden="1" w:uiPriority="39" w:unhideWhenUsed="1"/>
+    <w:lsdException w:name="toc 8" w:semiHidden="1" w:uiPriority="39" w:unhideWhenUsed="1"/>
+    <w:lsdException w:name="toc 9" w:semiHidden="1" w:uiPriority="39" w:unhideWhenUsed="1"/>
     <w:lsdException w:name="Normal Indent" w:semiHidden="1" w:unhideWhenUsed="1"/>
     <w:lsdException w:name="footnote text" w:semiHidden="1" w:unhideWhenUsed="1"/>
     <w:lsdException w:name="annotation text" w:semiHidden="1" w:unhideWhenUsed="1"/>
     <w:lsdException w:name="header" w:semiHidden="1" w:unhideWhenUsed="1"/>
     <w:lsdException w:name="footer" w:semiHidden="1" w:unhideWhenUsed="1"/>
     <w:lsdException w:name="index heading" w:semiHidden="1" w:unhideWhenUsed="1"/>
-    <w:lsdException w:name="caption" w:uiPriority="35" w:semiHidden="1" w:unhideWhenUsed="1" w:qFormat="1"/>
+    <w:lsdException w:name="caption" w:semiHidden="1" w:uiPriority="35" w:unhideWhenUsed="1" w:qFormat="1"/>
     <w:lsdException w:name="table of figures" w:semiHidden="1" w:unhideWhenUsed="1"/>
     <w:lsdException w:name="envelope address" w:semiHidden="1" w:unhideWhenUsed="1"/>
     <w:lsdException w:name="envelope return" w:semiHidden="1" w:unhideWhenUsed="1"/>
@@ -2375,7 +2076,7 @@
     <w:lsdException w:name="Title" w:uiPriority="10" w:qFormat="1"/>
     <w:lsdException w:name="Closing" w:semiHidden="1" w:unhideWhenUsed="1"/>
     <w:lsdException w:name="Signature" w:semiHidden="1" w:unhideWhenUsed="1"/>
-    <w:lsdException w:name="Default Paragraph Font" w:uiPriority="1" w:semiHidden="1" w:unhideWhenUsed="1"/>
+    <w:lsdException w:name="Default Paragraph Font" w:semiHidden="1" w:uiPriority="1" w:unhideWhenUsed="1"/>
     <w:lsdException w:name="Body Text" w:semiHidden="1" w:unhideWhenUsed="1"/>
     <w:lsdException w:name="Body Text Indent" w:semiHidden="1" w:unhideWhenUsed="1"/>
     <w:lsdException w:name="List Continue" w:semiHidden="1" w:unhideWhenUsed="1"/>
@@ -2575,8 +2276,8 @@
     <w:lsdException w:name="Subtle Reference" w:uiPriority="31" w:qFormat="1"/>
     <w:lsdException w:name="Intense Reference" w:uiPriority="32" w:qFormat="1"/>
     <w:lsdException w:name="Book Title" w:uiPriority="33" w:qFormat="1"/>
-    <w:lsdException w:name="Bibliography" w:uiPriority="37" w:semiHidden="1" w:unhideWhenUsed="1"/>
-    <w:lsdException w:name="TOC Heading" w:uiPriority="39" w:semiHidden="1" w:unhideWhenUsed="1" w:qFormat="1"/>
+    <w:lsdException w:name="Bibliography" w:semiHidden="1" w:uiPriority="37" w:unhideWhenUsed="1"/>
+    <w:lsdException w:name="TOC Heading" w:semiHidden="1" w:uiPriority="39" w:unhideWhenUsed="1" w:qFormat="1"/>
     <w:lsdException w:name="Plain Table 1" w:uiPriority="41"/>
     <w:lsdException w:name="Plain Table 2" w:uiPriority="42"/>
     <w:lsdException w:name="Plain Table 3" w:uiPriority="43"/>
@@ -2687,25 +2388,12 @@
     <w:lsdException w:name="Unresolved Mention" w:semiHidden="1" w:unhideWhenUsed="1"/>
     <w:lsdException w:name="Smart Link" w:semiHidden="1" w:unhideWhenUsed="1"/>
   </w:latentStyles>
-  <w:style w:type="paragraph" w:styleId="Normal" w:default="1">
+  <w:style w:type="paragraph" w:default="1" w:styleId="Normal">
     <w:name w:val="Normal"/>
     <w:qFormat/>
     <w:pPr>
-      <w:widowControl/>
-      <w:suppressAutoHyphens w:val="true"/>
-      <w:bidi w:val="0"/>
-      <w:spacing w:lineRule="auto" w:line="278" w:before="0" w:after="160"/>
-      <w:jc w:val="left"/>
+      <w:spacing w:after="160" w:line="278" w:lineRule="auto"/>
     </w:pPr>
-    <w:rPr>
-      <w:rFonts w:ascii="Aptos" w:hAnsi="Aptos" w:eastAsia="" w:cs="" w:asciiTheme="minorHAnsi" w:cstheme="minorBidi" w:eastAsiaTheme="minorEastAsia" w:hAnsiTheme="minorHAnsi"/>
-      <w:color w:val="auto"/>
-      <w:kern w:val="2"/>
-      <w:sz w:val="24"/>
-      <w:szCs w:val="24"/>
-      <w:lang w:val="en-GB" w:eastAsia="ja-JP" w:bidi="ar-SA"/>
-      <w14:ligatures w14:val="standardContextual"/>
-    </w:rPr>
   </w:style>
   <w:style w:type="paragraph" w:styleId="Heading1">
     <w:name w:val="heading 1"/>
@@ -2714,16 +2402,16 @@
     <w:link w:val="Heading1Char"/>
     <w:uiPriority w:val="9"/>
     <w:qFormat/>
-    <w:rsid w:val="002239bb"/>
+    <w:rsid w:val="002239BB"/>
     <w:pPr>
-      <w:keepNext w:val="true"/>
+      <w:keepNext/>
       <w:keepLines/>
       <w:spacing w:before="360" w:after="80"/>
       <w:outlineLvl w:val="0"/>
     </w:pPr>
     <w:rPr>
-      <w:rFonts w:ascii="Aptos Display" w:hAnsi="Aptos Display" w:eastAsia="" w:cs="" w:asciiTheme="majorHAnsi" w:cstheme="majorBidi" w:eastAsiaTheme="majorEastAsia" w:hAnsiTheme="majorHAnsi"/>
-      <w:color w:themeColor="accent1" w:themeShade="bf" w:val="0F4761"/>
+      <w:rFonts w:asciiTheme="majorHAnsi" w:eastAsiaTheme="majorEastAsia" w:hAnsiTheme="majorHAnsi" w:cstheme="majorBidi"/>
+      <w:color w:val="0F4761" w:themeColor="accent1" w:themeShade="BF"/>
       <w:sz w:val="40"/>
       <w:szCs w:val="40"/>
     </w:rPr>
@@ -2737,16 +2425,16 @@
     <w:semiHidden/>
     <w:unhideWhenUsed/>
     <w:qFormat/>
-    <w:rsid w:val="002239bb"/>
+    <w:rsid w:val="002239BB"/>
     <w:pPr>
-      <w:keepNext w:val="true"/>
+      <w:keepNext/>
       <w:keepLines/>
       <w:spacing w:before="160" w:after="80"/>
       <w:outlineLvl w:val="1"/>
     </w:pPr>
     <w:rPr>
-      <w:rFonts w:ascii="Aptos Display" w:hAnsi="Aptos Display" w:eastAsia="" w:cs="" w:asciiTheme="majorHAnsi" w:cstheme="majorBidi" w:eastAsiaTheme="majorEastAsia" w:hAnsiTheme="majorHAnsi"/>
-      <w:color w:themeColor="accent1" w:themeShade="bf" w:val="0F4761"/>
+      <w:rFonts w:asciiTheme="majorHAnsi" w:eastAsiaTheme="majorEastAsia" w:hAnsiTheme="majorHAnsi" w:cstheme="majorBidi"/>
+      <w:color w:val="0F4761" w:themeColor="accent1" w:themeShade="BF"/>
       <w:sz w:val="32"/>
       <w:szCs w:val="32"/>
     </w:rPr>
@@ -2760,16 +2448,16 @@
     <w:semiHidden/>
     <w:unhideWhenUsed/>
     <w:qFormat/>
-    <w:rsid w:val="002239bb"/>
+    <w:rsid w:val="002239BB"/>
     <w:pPr>
-      <w:keepNext w:val="true"/>
+      <w:keepNext/>
       <w:keepLines/>
       <w:spacing w:before="160" w:after="80"/>
       <w:outlineLvl w:val="2"/>
     </w:pPr>
     <w:rPr>
-      <w:rFonts w:eastAsia="" w:cs="" w:cstheme="majorBidi" w:eastAsiaTheme="majorEastAsia"/>
-      <w:color w:themeColor="accent1" w:themeShade="bf" w:val="0F4761"/>
+      <w:rFonts w:eastAsiaTheme="majorEastAsia" w:cstheme="majorBidi"/>
+      <w:color w:val="0F4761" w:themeColor="accent1" w:themeShade="BF"/>
       <w:sz w:val="28"/>
       <w:szCs w:val="28"/>
     </w:rPr>
@@ -2783,18 +2471,18 @@
     <w:semiHidden/>
     <w:unhideWhenUsed/>
     <w:qFormat/>
-    <w:rsid w:val="002239bb"/>
+    <w:rsid w:val="002239BB"/>
     <w:pPr>
-      <w:keepNext w:val="true"/>
+      <w:keepNext/>
       <w:keepLines/>
       <w:spacing w:before="80" w:after="40"/>
       <w:outlineLvl w:val="3"/>
     </w:pPr>
     <w:rPr>
-      <w:rFonts w:eastAsia="" w:cs="" w:cstheme="majorBidi" w:eastAsiaTheme="majorEastAsia"/>
+      <w:rFonts w:eastAsiaTheme="majorEastAsia" w:cstheme="majorBidi"/>
       <w:i/>
       <w:iCs/>
-      <w:color w:themeColor="accent1" w:themeShade="bf" w:val="0F4761"/>
+      <w:color w:val="0F4761" w:themeColor="accent1" w:themeShade="BF"/>
     </w:rPr>
   </w:style>
   <w:style w:type="paragraph" w:styleId="Heading5">
@@ -2806,16 +2494,16 @@
     <w:semiHidden/>
     <w:unhideWhenUsed/>
     <w:qFormat/>
-    <w:rsid w:val="002239bb"/>
+    <w:rsid w:val="002239BB"/>
     <w:pPr>
-      <w:keepNext w:val="true"/>
+      <w:keepNext/>
       <w:keepLines/>
       <w:spacing w:before="80" w:after="40"/>
       <w:outlineLvl w:val="4"/>
     </w:pPr>
     <w:rPr>
-      <w:rFonts w:eastAsia="" w:cs="" w:cstheme="majorBidi" w:eastAsiaTheme="majorEastAsia"/>
-      <w:color w:themeColor="accent1" w:themeShade="bf" w:val="0F4761"/>
+      <w:rFonts w:eastAsiaTheme="majorEastAsia" w:cstheme="majorBidi"/>
+      <w:color w:val="0F4761" w:themeColor="accent1" w:themeShade="BF"/>
     </w:rPr>
   </w:style>
   <w:style w:type="paragraph" w:styleId="Heading6">
@@ -2827,18 +2515,18 @@
     <w:semiHidden/>
     <w:unhideWhenUsed/>
     <w:qFormat/>
-    <w:rsid w:val="002239bb"/>
+    <w:rsid w:val="002239BB"/>
     <w:pPr>
-      <w:keepNext w:val="true"/>
+      <w:keepNext/>
       <w:keepLines/>
       <w:spacing w:before="40" w:after="0"/>
       <w:outlineLvl w:val="5"/>
     </w:pPr>
     <w:rPr>
-      <w:rFonts w:eastAsia="" w:cs="" w:cstheme="majorBidi" w:eastAsiaTheme="majorEastAsia"/>
+      <w:rFonts w:eastAsiaTheme="majorEastAsia" w:cstheme="majorBidi"/>
       <w:i/>
       <w:iCs/>
-      <w:color w:themeColor="text1" w:themeTint="a6" w:val="595959"/>
+      <w:color w:val="595959" w:themeColor="text1" w:themeTint="A6"/>
     </w:rPr>
   </w:style>
   <w:style w:type="paragraph" w:styleId="Heading7">
@@ -2850,16 +2538,16 @@
     <w:semiHidden/>
     <w:unhideWhenUsed/>
     <w:qFormat/>
-    <w:rsid w:val="002239bb"/>
+    <w:rsid w:val="002239BB"/>
     <w:pPr>
-      <w:keepNext w:val="true"/>
+      <w:keepNext/>
       <w:keepLines/>
       <w:spacing w:before="40" w:after="0"/>
       <w:outlineLvl w:val="6"/>
     </w:pPr>
     <w:rPr>
-      <w:rFonts w:eastAsia="" w:cs="" w:cstheme="majorBidi" w:eastAsiaTheme="majorEastAsia"/>
-      <w:color w:themeColor="text1" w:themeTint="a6" w:val="595959"/>
+      <w:rFonts w:eastAsiaTheme="majorEastAsia" w:cstheme="majorBidi"/>
+      <w:color w:val="595959" w:themeColor="text1" w:themeTint="A6"/>
     </w:rPr>
   </w:style>
   <w:style w:type="paragraph" w:styleId="Heading8">
@@ -2871,18 +2559,18 @@
     <w:semiHidden/>
     <w:unhideWhenUsed/>
     <w:qFormat/>
-    <w:rsid w:val="002239bb"/>
+    <w:rsid w:val="002239BB"/>
     <w:pPr>
-      <w:keepNext w:val="true"/>
+      <w:keepNext/>
       <w:keepLines/>
-      <w:spacing w:before="0" w:after="0"/>
+      <w:spacing w:after="0"/>
       <w:outlineLvl w:val="7"/>
     </w:pPr>
     <w:rPr>
-      <w:rFonts w:eastAsia="" w:cs="" w:cstheme="majorBidi" w:eastAsiaTheme="majorEastAsia"/>
+      <w:rFonts w:eastAsiaTheme="majorEastAsia" w:cstheme="majorBidi"/>
       <w:i/>
       <w:iCs/>
-      <w:color w:themeColor="text1" w:themeTint="d8" w:val="272727"/>
+      <w:color w:val="272727" w:themeColor="text1" w:themeTint="D8"/>
     </w:rPr>
   </w:style>
   <w:style w:type="paragraph" w:styleId="Heading9">
@@ -2894,195 +2582,214 @@
     <w:semiHidden/>
     <w:unhideWhenUsed/>
     <w:qFormat/>
-    <w:rsid w:val="002239bb"/>
+    <w:rsid w:val="002239BB"/>
     <w:pPr>
-      <w:keepNext w:val="true"/>
+      <w:keepNext/>
       <w:keepLines/>
-      <w:spacing w:before="0" w:after="0"/>
+      <w:spacing w:after="0"/>
       <w:outlineLvl w:val="8"/>
     </w:pPr>
     <w:rPr>
-      <w:rFonts w:eastAsia="" w:cs="" w:cstheme="majorBidi" w:eastAsiaTheme="majorEastAsia"/>
-      <w:color w:themeColor="text1" w:themeTint="d8" w:val="272727"/>
+      <w:rFonts w:eastAsiaTheme="majorEastAsia" w:cstheme="majorBidi"/>
+      <w:color w:val="272727" w:themeColor="text1" w:themeTint="D8"/>
     </w:rPr>
   </w:style>
-  <w:style w:type="character" w:styleId="DefaultParagraphFont" w:default="1">
+  <w:style w:type="character" w:default="1" w:styleId="DefaultParagraphFont">
     <w:name w:val="Default Paragraph Font"/>
     <w:uiPriority w:val="1"/>
     <w:semiHidden/>
     <w:unhideWhenUsed/>
-    <w:qFormat/>
-    <w:rPr/>
-  </w:style>
-  <w:style w:type="character" w:styleId="Heading1Char" w:customStyle="1">
+  </w:style>
+  <w:style w:type="table" w:default="1" w:styleId="TableNormal">
+    <w:name w:val="Normal Table"/>
+    <w:uiPriority w:val="99"/>
+    <w:semiHidden/>
+    <w:unhideWhenUsed/>
+    <w:tblPr>
+      <w:tblInd w:w="0" w:type="dxa"/>
+      <w:tblCellMar>
+        <w:top w:w="0" w:type="dxa"/>
+        <w:left w:w="108" w:type="dxa"/>
+        <w:bottom w:w="0" w:type="dxa"/>
+        <w:right w:w="108" w:type="dxa"/>
+      </w:tblCellMar>
+    </w:tblPr>
+  </w:style>
+  <w:style w:type="numbering" w:default="1" w:styleId="NoList">
+    <w:name w:val="No List"/>
+    <w:uiPriority w:val="99"/>
+    <w:semiHidden/>
+    <w:unhideWhenUsed/>
+  </w:style>
+  <w:style w:type="character" w:customStyle="1" w:styleId="Heading1Char">
     <w:name w:val="Heading 1 Char"/>
     <w:basedOn w:val="DefaultParagraphFont"/>
     <w:link w:val="Heading1"/>
     <w:uiPriority w:val="9"/>
     <w:qFormat/>
-    <w:rsid w:val="002239bb"/>
+    <w:rsid w:val="002239BB"/>
     <w:rPr>
-      <w:rFonts w:ascii="Aptos Display" w:hAnsi="Aptos Display" w:eastAsia="" w:cs="" w:asciiTheme="majorHAnsi" w:cstheme="majorBidi" w:eastAsiaTheme="majorEastAsia" w:hAnsiTheme="majorHAnsi"/>
-      <w:color w:themeColor="accent1" w:themeShade="bf" w:val="0F4761"/>
+      <w:rFonts w:asciiTheme="majorHAnsi" w:eastAsiaTheme="majorEastAsia" w:hAnsiTheme="majorHAnsi" w:cstheme="majorBidi"/>
+      <w:color w:val="0F4761" w:themeColor="accent1" w:themeShade="BF"/>
       <w:sz w:val="40"/>
       <w:szCs w:val="40"/>
     </w:rPr>
   </w:style>
-  <w:style w:type="character" w:styleId="Heading2Char" w:customStyle="1">
+  <w:style w:type="character" w:customStyle="1" w:styleId="Heading2Char">
     <w:name w:val="Heading 2 Char"/>
     <w:basedOn w:val="DefaultParagraphFont"/>
     <w:link w:val="Heading2"/>
     <w:uiPriority w:val="9"/>
     <w:semiHidden/>
     <w:qFormat/>
-    <w:rsid w:val="002239bb"/>
+    <w:rsid w:val="002239BB"/>
     <w:rPr>
-      <w:rFonts w:ascii="Aptos Display" w:hAnsi="Aptos Display" w:eastAsia="" w:cs="" w:asciiTheme="majorHAnsi" w:cstheme="majorBidi" w:eastAsiaTheme="majorEastAsia" w:hAnsiTheme="majorHAnsi"/>
-      <w:color w:themeColor="accent1" w:themeShade="bf" w:val="0F4761"/>
+      <w:rFonts w:asciiTheme="majorHAnsi" w:eastAsiaTheme="majorEastAsia" w:hAnsiTheme="majorHAnsi" w:cstheme="majorBidi"/>
+      <w:color w:val="0F4761" w:themeColor="accent1" w:themeShade="BF"/>
       <w:sz w:val="32"/>
       <w:szCs w:val="32"/>
     </w:rPr>
   </w:style>
-  <w:style w:type="character" w:styleId="Heading3Char" w:customStyle="1">
+  <w:style w:type="character" w:customStyle="1" w:styleId="Heading3Char">
     <w:name w:val="Heading 3 Char"/>
     <w:basedOn w:val="DefaultParagraphFont"/>
     <w:link w:val="Heading3"/>
     <w:uiPriority w:val="9"/>
     <w:semiHidden/>
     <w:qFormat/>
-    <w:rsid w:val="002239bb"/>
+    <w:rsid w:val="002239BB"/>
     <w:rPr>
-      <w:rFonts w:eastAsia="" w:cs="" w:cstheme="majorBidi" w:eastAsiaTheme="majorEastAsia"/>
-      <w:color w:themeColor="accent1" w:themeShade="bf" w:val="0F4761"/>
+      <w:rFonts w:eastAsiaTheme="majorEastAsia" w:cstheme="majorBidi"/>
+      <w:color w:val="0F4761" w:themeColor="accent1" w:themeShade="BF"/>
       <w:sz w:val="28"/>
       <w:szCs w:val="28"/>
     </w:rPr>
   </w:style>
-  <w:style w:type="character" w:styleId="Heading4Char" w:customStyle="1">
+  <w:style w:type="character" w:customStyle="1" w:styleId="Heading4Char">
     <w:name w:val="Heading 4 Char"/>
     <w:basedOn w:val="DefaultParagraphFont"/>
     <w:link w:val="Heading4"/>
     <w:uiPriority w:val="9"/>
     <w:semiHidden/>
     <w:qFormat/>
-    <w:rsid w:val="002239bb"/>
+    <w:rsid w:val="002239BB"/>
     <w:rPr>
-      <w:rFonts w:eastAsia="" w:cs="" w:cstheme="majorBidi" w:eastAsiaTheme="majorEastAsia"/>
+      <w:rFonts w:eastAsiaTheme="majorEastAsia" w:cstheme="majorBidi"/>
       <w:i/>
       <w:iCs/>
-      <w:color w:themeColor="accent1" w:themeShade="bf" w:val="0F4761"/>
+      <w:color w:val="0F4761" w:themeColor="accent1" w:themeShade="BF"/>
     </w:rPr>
   </w:style>
-  <w:style w:type="character" w:styleId="Heading5Char" w:customStyle="1">
+  <w:style w:type="character" w:customStyle="1" w:styleId="Heading5Char">
     <w:name w:val="Heading 5 Char"/>
     <w:basedOn w:val="DefaultParagraphFont"/>
     <w:link w:val="Heading5"/>
     <w:uiPriority w:val="9"/>
     <w:semiHidden/>
     <w:qFormat/>
-    <w:rsid w:val="002239bb"/>
+    <w:rsid w:val="002239BB"/>
     <w:rPr>
-      <w:rFonts w:eastAsia="" w:cs="" w:cstheme="majorBidi" w:eastAsiaTheme="majorEastAsia"/>
-      <w:color w:themeColor="accent1" w:themeShade="bf" w:val="0F4761"/>
+      <w:rFonts w:eastAsiaTheme="majorEastAsia" w:cstheme="majorBidi"/>
+      <w:color w:val="0F4761" w:themeColor="accent1" w:themeShade="BF"/>
     </w:rPr>
   </w:style>
-  <w:style w:type="character" w:styleId="Heading6Char" w:customStyle="1">
+  <w:style w:type="character" w:customStyle="1" w:styleId="Heading6Char">
     <w:name w:val="Heading 6 Char"/>
     <w:basedOn w:val="DefaultParagraphFont"/>
     <w:link w:val="Heading6"/>
     <w:uiPriority w:val="9"/>
     <w:semiHidden/>
     <w:qFormat/>
-    <w:rsid w:val="002239bb"/>
+    <w:rsid w:val="002239BB"/>
     <w:rPr>
-      <w:rFonts w:eastAsia="" w:cs="" w:cstheme="majorBidi" w:eastAsiaTheme="majorEastAsia"/>
+      <w:rFonts w:eastAsiaTheme="majorEastAsia" w:cstheme="majorBidi"/>
       <w:i/>
       <w:iCs/>
-      <w:color w:themeColor="text1" w:themeTint="a6" w:val="595959"/>
+      <w:color w:val="595959" w:themeColor="text1" w:themeTint="A6"/>
     </w:rPr>
   </w:style>
-  <w:style w:type="character" w:styleId="Heading7Char" w:customStyle="1">
+  <w:style w:type="character" w:customStyle="1" w:styleId="Heading7Char">
     <w:name w:val="Heading 7 Char"/>
     <w:basedOn w:val="DefaultParagraphFont"/>
     <w:link w:val="Heading7"/>
     <w:uiPriority w:val="9"/>
     <w:semiHidden/>
     <w:qFormat/>
-    <w:rsid w:val="002239bb"/>
+    <w:rsid w:val="002239BB"/>
     <w:rPr>
-      <w:rFonts w:eastAsia="" w:cs="" w:cstheme="majorBidi" w:eastAsiaTheme="majorEastAsia"/>
-      <w:color w:themeColor="text1" w:themeTint="a6" w:val="595959"/>
+      <w:rFonts w:eastAsiaTheme="majorEastAsia" w:cstheme="majorBidi"/>
+      <w:color w:val="595959" w:themeColor="text1" w:themeTint="A6"/>
     </w:rPr>
   </w:style>
-  <w:style w:type="character" w:styleId="Heading8Char" w:customStyle="1">
+  <w:style w:type="character" w:customStyle="1" w:styleId="Heading8Char">
     <w:name w:val="Heading 8 Char"/>
     <w:basedOn w:val="DefaultParagraphFont"/>
     <w:link w:val="Heading8"/>
     <w:uiPriority w:val="9"/>
     <w:semiHidden/>
     <w:qFormat/>
-    <w:rsid w:val="002239bb"/>
+    <w:rsid w:val="002239BB"/>
     <w:rPr>
-      <w:rFonts w:eastAsia="" w:cs="" w:cstheme="majorBidi" w:eastAsiaTheme="majorEastAsia"/>
+      <w:rFonts w:eastAsiaTheme="majorEastAsia" w:cstheme="majorBidi"/>
       <w:i/>
       <w:iCs/>
-      <w:color w:themeColor="text1" w:themeTint="d8" w:val="272727"/>
+      <w:color w:val="272727" w:themeColor="text1" w:themeTint="D8"/>
     </w:rPr>
   </w:style>
-  <w:style w:type="character" w:styleId="Heading9Char" w:customStyle="1">
+  <w:style w:type="character" w:customStyle="1" w:styleId="Heading9Char">
     <w:name w:val="Heading 9 Char"/>
     <w:basedOn w:val="DefaultParagraphFont"/>
     <w:link w:val="Heading9"/>
     <w:uiPriority w:val="9"/>
     <w:semiHidden/>
     <w:qFormat/>
-    <w:rsid w:val="002239bb"/>
+    <w:rsid w:val="002239BB"/>
     <w:rPr>
-      <w:rFonts w:eastAsia="" w:cs="" w:cstheme="majorBidi" w:eastAsiaTheme="majorEastAsia"/>
-      <w:color w:themeColor="text1" w:themeTint="d8" w:val="272727"/>
+      <w:rFonts w:eastAsiaTheme="majorEastAsia" w:cstheme="majorBidi"/>
+      <w:color w:val="272727" w:themeColor="text1" w:themeTint="D8"/>
     </w:rPr>
   </w:style>
-  <w:style w:type="character" w:styleId="TitleChar" w:customStyle="1">
+  <w:style w:type="character" w:customStyle="1" w:styleId="TitleChar">
     <w:name w:val="Title Char"/>
     <w:basedOn w:val="DefaultParagraphFont"/>
     <w:link w:val="Title"/>
     <w:uiPriority w:val="10"/>
     <w:qFormat/>
-    <w:rsid w:val="002239bb"/>
+    <w:rsid w:val="002239BB"/>
     <w:rPr>
-      <w:rFonts w:ascii="Aptos Display" w:hAnsi="Aptos Display" w:eastAsia="" w:cs="" w:asciiTheme="majorHAnsi" w:cstheme="majorBidi" w:eastAsiaTheme="majorEastAsia" w:hAnsiTheme="majorHAnsi"/>
+      <w:rFonts w:asciiTheme="majorHAnsi" w:eastAsiaTheme="majorEastAsia" w:hAnsiTheme="majorHAnsi" w:cstheme="majorBidi"/>
       <w:spacing w:val="-10"/>
       <w:kern w:val="2"/>
       <w:sz w:val="56"/>
       <w:szCs w:val="56"/>
     </w:rPr>
   </w:style>
-  <w:style w:type="character" w:styleId="SubtitleChar" w:customStyle="1">
+  <w:style w:type="character" w:customStyle="1" w:styleId="SubtitleChar">
     <w:name w:val="Subtitle Char"/>
     <w:basedOn w:val="DefaultParagraphFont"/>
     <w:link w:val="Subtitle"/>
     <w:uiPriority w:val="11"/>
     <w:qFormat/>
-    <w:rsid w:val="002239bb"/>
+    <w:rsid w:val="002239BB"/>
     <w:rPr>
-      <w:rFonts w:eastAsia="" w:cs="" w:cstheme="majorBidi" w:eastAsiaTheme="majorEastAsia"/>
-      <w:color w:themeColor="text1" w:themeTint="a6" w:val="595959"/>
+      <w:rFonts w:eastAsiaTheme="majorEastAsia" w:cstheme="majorBidi"/>
+      <w:color w:val="595959" w:themeColor="text1" w:themeTint="A6"/>
       <w:spacing w:val="15"/>
       <w:sz w:val="28"/>
       <w:szCs w:val="28"/>
     </w:rPr>
   </w:style>
-  <w:style w:type="character" w:styleId="QuoteChar" w:customStyle="1">
+  <w:style w:type="character" w:customStyle="1" w:styleId="QuoteChar">
     <w:name w:val="Quote Char"/>
     <w:basedOn w:val="DefaultParagraphFont"/>
     <w:link w:val="Quote"/>
     <w:uiPriority w:val="29"/>
     <w:qFormat/>
-    <w:rsid w:val="002239bb"/>
+    <w:rsid w:val="002239BB"/>
     <w:rPr>
       <w:i/>
       <w:iCs/>
-      <w:color w:themeColor="text1" w:themeTint="bf" w:val="404040"/>
+      <w:color w:val="404040" w:themeColor="text1" w:themeTint="BF"/>
     </w:rPr>
   </w:style>
   <w:style w:type="character" w:styleId="IntenseEmphasis">
@@ -3090,24 +2797,24 @@
     <w:basedOn w:val="DefaultParagraphFont"/>
     <w:uiPriority w:val="21"/>
     <w:qFormat/>
-    <w:rsid w:val="002239bb"/>
+    <w:rsid w:val="002239BB"/>
     <w:rPr>
       <w:i/>
       <w:iCs/>
-      <w:color w:themeColor="accent1" w:themeShade="bf" w:val="0F4761"/>
+      <w:color w:val="0F4761" w:themeColor="accent1" w:themeShade="BF"/>
     </w:rPr>
   </w:style>
-  <w:style w:type="character" w:styleId="IntenseQuoteChar" w:customStyle="1">
+  <w:style w:type="character" w:customStyle="1" w:styleId="IntenseQuoteChar">
     <w:name w:val="Intense Quote Char"/>
     <w:basedOn w:val="DefaultParagraphFont"/>
     <w:link w:val="IntenseQuote"/>
     <w:uiPriority w:val="30"/>
     <w:qFormat/>
-    <w:rsid w:val="002239bb"/>
+    <w:rsid w:val="002239BB"/>
     <w:rPr>
       <w:i/>
       <w:iCs/>
-      <w:color w:themeColor="accent1" w:themeShade="bf" w:val="0F4761"/>
+      <w:color w:val="0F4761" w:themeColor="accent1" w:themeShade="BF"/>
     </w:rPr>
   </w:style>
   <w:style w:type="character" w:styleId="IntenseReference">
@@ -3115,26 +2822,26 @@
     <w:basedOn w:val="DefaultParagraphFont"/>
     <w:uiPriority w:val="32"/>
     <w:qFormat/>
-    <w:rsid w:val="002239bb"/>
+    <w:rsid w:val="002239BB"/>
     <w:rPr>
       <w:b/>
       <w:bCs/>
       <w:smallCaps/>
-      <w:color w:themeColor="accent1" w:themeShade="bf" w:val="0F4761"/>
+      <w:color w:val="0F4761" w:themeColor="accent1" w:themeShade="BF"/>
       <w:spacing w:val="5"/>
     </w:rPr>
   </w:style>
-  <w:style w:type="paragraph" w:styleId="Heading">
+  <w:style w:type="paragraph" w:customStyle="1" w:styleId="Heading">
     <w:name w:val="Heading"/>
     <w:basedOn w:val="Normal"/>
     <w:next w:val="BodyText"/>
     <w:qFormat/>
     <w:pPr>
-      <w:keepNext w:val="true"/>
+      <w:keepNext/>
       <w:spacing w:before="240" w:after="120"/>
     </w:pPr>
     <w:rPr>
-      <w:rFonts w:ascii="Liberation Sans" w:hAnsi="Liberation Sans" w:eastAsia="Unifont" w:cs="FreeSans"/>
+      <w:rFonts w:ascii="Liberation Sans" w:eastAsia="Unifont" w:hAnsi="Liberation Sans" w:cs="FreeSans"/>
       <w:sz w:val="28"/>
       <w:szCs w:val="28"/>
     </w:rPr>
@@ -3143,14 +2850,12 @@
     <w:name w:val="Body Text"/>
     <w:basedOn w:val="Normal"/>
     <w:pPr>
-      <w:spacing w:lineRule="auto" w:line="276" w:before="0" w:after="140"/>
+      <w:spacing w:after="140" w:line="276" w:lineRule="auto"/>
     </w:pPr>
-    <w:rPr/>
   </w:style>
   <w:style w:type="paragraph" w:styleId="List">
     <w:name w:val="List"/>
     <w:basedOn w:val="BodyText"/>
-    <w:pPr/>
     <w:rPr>
       <w:rFonts w:cs="FreeSans"/>
     </w:rPr>
@@ -3167,11 +2872,9 @@
       <w:rFonts w:cs="FreeSans"/>
       <w:i/>
       <w:iCs/>
-      <w:sz w:val="24"/>
-      <w:szCs w:val="24"/>
     </w:rPr>
   </w:style>
-  <w:style w:type="paragraph" w:styleId="Index">
+  <w:style w:type="paragraph" w:customStyle="1" w:styleId="Index">
     <w:name w:val="Index"/>
     <w:basedOn w:val="Normal"/>
     <w:qFormat/>
@@ -3189,15 +2892,14 @@
     <w:link w:val="TitleChar"/>
     <w:uiPriority w:val="10"/>
     <w:qFormat/>
-    <w:rsid w:val="002239bb"/>
+    <w:rsid w:val="002239BB"/>
     <w:pPr>
-      <w:spacing w:lineRule="auto" w:line="240" w:before="0" w:after="80"/>
+      <w:spacing w:after="80" w:line="240" w:lineRule="auto"/>
       <w:contextualSpacing/>
     </w:pPr>
     <w:rPr>
-      <w:rFonts w:ascii="Aptos Display" w:hAnsi="Aptos Display" w:eastAsia="" w:cs="" w:asciiTheme="majorHAnsi" w:cstheme="majorBidi" w:eastAsiaTheme="majorEastAsia" w:hAnsiTheme="majorHAnsi"/>
+      <w:rFonts w:asciiTheme="majorHAnsi" w:eastAsiaTheme="majorEastAsia" w:hAnsiTheme="majorHAnsi" w:cstheme="majorBidi"/>
       <w:spacing w:val="-10"/>
-      <w:kern w:val="2"/>
       <w:sz w:val="56"/>
       <w:szCs w:val="56"/>
     </w:rPr>
@@ -3209,11 +2911,10 @@
     <w:link w:val="SubtitleChar"/>
     <w:uiPriority w:val="11"/>
     <w:qFormat/>
-    <w:rsid w:val="002239bb"/>
-    <w:pPr/>
+    <w:rsid w:val="002239BB"/>
     <w:rPr>
-      <w:rFonts w:eastAsia="" w:cs="" w:cstheme="majorBidi" w:eastAsiaTheme="majorEastAsia"/>
-      <w:color w:themeColor="text1" w:themeTint="a6" w:val="595959"/>
+      <w:rFonts w:eastAsiaTheme="majorEastAsia" w:cstheme="majorBidi"/>
+      <w:color w:val="595959" w:themeColor="text1" w:themeTint="A6"/>
       <w:spacing w:val="15"/>
       <w:sz w:val="28"/>
       <w:szCs w:val="28"/>
@@ -3226,15 +2927,15 @@
     <w:link w:val="QuoteChar"/>
     <w:uiPriority w:val="29"/>
     <w:qFormat/>
-    <w:rsid w:val="002239bb"/>
+    <w:rsid w:val="002239BB"/>
     <w:pPr>
-      <w:spacing w:before="160" w:after="160"/>
+      <w:spacing w:before="160"/>
       <w:jc w:val="center"/>
     </w:pPr>
     <w:rPr>
       <w:i/>
       <w:iCs/>
-      <w:color w:themeColor="text1" w:themeTint="bf" w:val="404040"/>
+      <w:color w:val="404040" w:themeColor="text1" w:themeTint="BF"/>
     </w:rPr>
   </w:style>
   <w:style w:type="paragraph" w:styleId="ListParagraph">
@@ -3242,13 +2943,11 @@
     <w:basedOn w:val="Normal"/>
     <w:uiPriority w:val="34"/>
     <w:qFormat/>
-    <w:rsid w:val="002239bb"/>
+    <w:rsid w:val="002239BB"/>
     <w:pPr>
-      <w:spacing w:before="0" w:after="160"/>
       <w:ind w:left="720"/>
       <w:contextualSpacing/>
     </w:pPr>
-    <w:rPr/>
   </w:style>
   <w:style w:type="paragraph" w:styleId="IntenseQuote">
     <w:name w:val="Intense Quote"/>
@@ -3257,11 +2956,11 @@
     <w:link w:val="IntenseQuoteChar"/>
     <w:uiPriority w:val="30"/>
     <w:qFormat/>
-    <w:rsid w:val="002239bb"/>
+    <w:rsid w:val="002239BB"/>
     <w:pPr>
       <w:pBdr>
-        <w:top w:val="single" w:sz="4" w:space="10" w:color="0F4761" w:themeColor="accent1" w:themeShade="bf"/>
-        <w:bottom w:val="single" w:sz="4" w:space="10" w:color="0F4761" w:themeColor="accent1" w:themeShade="bf"/>
+        <w:top w:val="single" w:sz="4" w:space="10" w:color="0F4761" w:themeColor="accent1" w:themeShade="BF"/>
+        <w:bottom w:val="single" w:sz="4" w:space="10" w:color="0F4761" w:themeColor="accent1" w:themeShade="BF"/>
       </w:pBdr>
       <w:spacing w:before="360" w:after="360"/>
       <w:ind w:left="864" w:right="864"/>
@@ -3270,20 +2969,19 @@
     <w:rPr>
       <w:i/>
       <w:iCs/>
-      <w:color w:themeColor="accent1" w:themeShade="bf" w:val="0F4761"/>
+      <w:color w:val="0F4761" w:themeColor="accent1" w:themeShade="BF"/>
     </w:rPr>
   </w:style>
-  <w:style w:type="paragraph" w:styleId="TableContents">
+  <w:style w:type="paragraph" w:customStyle="1" w:styleId="TableContents">
     <w:name w:val="Table Contents"/>
     <w:basedOn w:val="Normal"/>
     <w:qFormat/>
     <w:pPr>
-      <w:widowControl w:val="false"/>
+      <w:widowControl w:val="0"/>
       <w:suppressLineNumbers/>
     </w:pPr>
-    <w:rPr/>
-  </w:style>
-  <w:style w:type="paragraph" w:styleId="HorizontalLine">
+  </w:style>
+  <w:style w:type="paragraph" w:customStyle="1" w:styleId="HorizontalLine">
     <w:name w:val="Horizontal Line"/>
     <w:basedOn w:val="Normal"/>
     <w:next w:val="BodyText"/>
@@ -3293,50 +2991,26 @@
       <w:pBdr>
         <w:bottom w:val="double" w:sz="2" w:space="0" w:color="808080"/>
       </w:pBdr>
-      <w:spacing w:before="0" w:after="283"/>
+      <w:spacing w:after="283"/>
     </w:pPr>
     <w:rPr>
       <w:sz w:val="12"/>
       <w:szCs w:val="12"/>
     </w:rPr>
   </w:style>
-  <w:style w:type="numbering" w:styleId="NoList" w:default="1">
-    <w:name w:val="No List"/>
-    <w:uiPriority w:val="99"/>
-    <w:semiHidden/>
-    <w:unhideWhenUsed/>
-    <w:qFormat/>
-  </w:style>
-  <w:style w:type="table" w:default="1" w:styleId="TableNormal">
-    <w:name w:val="Normal Table"/>
-    <w:uiPriority w:val="99"/>
-    <w:semiHidden/>
-    <w:unhideWhenUsed/>
-    <w:tblPr>
-      <w:tblCellMar>
-        <w:top w:w="0" w:type="dxa"/>
-        <w:left w:w="108" w:type="dxa"/>
-        <w:bottom w:w="0" w:type="dxa"/>
-        <w:right w:w="108" w:type="dxa"/>
-      </w:tblCellMar>
-    </w:tblPr>
-  </w:style>
   <w:style w:type="table" w:styleId="TableGrid">
     <w:name w:val="Table Grid"/>
     <w:basedOn w:val="TableNormal"/>
     <w:uiPriority w:val="39"/>
-    <w:rsid w:val="002239bb"/>
-    <w:pPr>
-      <w:spacing w:after="0" w:line="240" w:lineRule="auto"/>
-    </w:pPr>
+    <w:rsid w:val="002239BB"/>
     <w:tblPr>
       <w:tblBorders>
-        <w:top w:val="single" w:color="auto" w:sz="4" w:space="0"/>
-        <w:left w:val="single" w:color="auto" w:sz="4" w:space="0"/>
-        <w:bottom w:val="single" w:color="auto" w:sz="4" w:space="0"/>
-        <w:right w:val="single" w:color="auto" w:sz="4" w:space="0"/>
-        <w:insideH w:val="single" w:color="auto" w:sz="4" w:space="0"/>
-        <w:insideV w:val="single" w:color="auto" w:sz="4" w:space="0"/>
+        <w:top w:val="single" w:sz="4" w:space="0" w:color="auto"/>
+        <w:left w:val="single" w:sz="4" w:space="0" w:color="auto"/>
+        <w:bottom w:val="single" w:sz="4" w:space="0" w:color="auto"/>
+        <w:right w:val="single" w:sz="4" w:space="0" w:color="auto"/>
+        <w:insideH w:val="single" w:sz="4" w:space="0" w:color="auto"/>
+        <w:insideV w:val="single" w:sz="4" w:space="0" w:color="auto"/>
       </w:tblBorders>
     </w:tblPr>
   </w:style>
@@ -3344,54 +3018,54 @@
 </file>
 
 <file path=word/theme/theme1.xml><?xml version="1.0" encoding="utf-8"?>
-<a:theme xmlns:a="http://schemas.openxmlformats.org/drawingml/2006/main" xmlns:r="http://schemas.openxmlformats.org/officeDocument/2006/relationships" name="Office Theme">
+<a:theme xmlns:a="http://schemas.openxmlformats.org/drawingml/2006/main" name="Office Theme">
   <a:themeElements>
     <a:clrScheme name="Office">
       <a:dk1>
         <a:srgbClr val="000000"/>
       </a:dk1>
       <a:lt1>
-        <a:srgbClr val="ffffff"/>
+        <a:srgbClr val="FFFFFF"/>
       </a:lt1>
       <a:dk2>
-        <a:srgbClr val="0e2841"/>
+        <a:srgbClr val="0E2841"/>
       </a:dk2>
       <a:lt2>
-        <a:srgbClr val="e8e8e8"/>
+        <a:srgbClr val="E8E8E8"/>
       </a:lt2>
       <a:accent1>
         <a:srgbClr val="156082"/>
       </a:accent1>
       <a:accent2>
-        <a:srgbClr val="e97132"/>
+        <a:srgbClr val="E97132"/>
       </a:accent2>
       <a:accent3>
-        <a:srgbClr val="196b24"/>
+        <a:srgbClr val="196B24"/>
       </a:accent3>
       <a:accent4>
-        <a:srgbClr val="0f9ed5"/>
+        <a:srgbClr val="0F9ED5"/>
       </a:accent4>
       <a:accent5>
-        <a:srgbClr val="a02b93"/>
+        <a:srgbClr val="A02B93"/>
       </a:accent5>
       <a:accent6>
-        <a:srgbClr val="4ea72e"/>
+        <a:srgbClr val="4EA72E"/>
       </a:accent6>
       <a:hlink>
         <a:srgbClr val="467886"/>
       </a:hlink>
       <a:folHlink>
-        <a:srgbClr val="96607d"/>
+        <a:srgbClr val="96607D"/>
       </a:folHlink>
     </a:clrScheme>
     <a:fontScheme name="Office">
       <a:majorFont>
-        <a:latin typeface="Aptos Display" panose="02110004020202020204" pitchFamily="0" charset="1"/>
+        <a:latin typeface="Aptos Display" panose="02110004020202020204"/>
         <a:ea typeface=""/>
         <a:cs typeface=""/>
       </a:majorFont>
       <a:minorFont>
-        <a:latin typeface="Aptos" panose="02110004020202020204" pitchFamily="0" charset="1"/>
+        <a:latin typeface="Aptos" panose="02110004020202020204"/>
         <a:ea typeface=""/>
         <a:cs typeface=""/>
       </a:minorFont>
@@ -3423,7 +3097,7 @@
             </a:gs>
           </a:gsLst>
           <a:lin ang="5400000" scaled="0"/>
-          <a:tileRect l="0" t="0" r="0" b="0"/>
+          <a:tileRect/>
         </a:gradFill>
         <a:gradFill>
           <a:gsLst>
@@ -3447,7 +3121,7 @@
             </a:gs>
           </a:gsLst>
           <a:lin ang="5400000" scaled="0"/>
-          <a:tileRect l="0" t="0" r="0" b="0"/>
+          <a:tileRect/>
         </a:gradFill>
       </a:fillStyleLst>
       <a:lnStyleLst>
@@ -3507,11 +3181,13 @@
             </a:gs>
           </a:gsLst>
           <a:lin ang="5400000" scaled="0"/>
-          <a:tileRect l="0" t="0" r="0" b="0"/>
+          <a:tileRect/>
         </a:gradFill>
       </a:bgFillStyleLst>
     </a:fmtScheme>
   </a:themeElements>
+  <a:objectDefaults/>
+  <a:extraClrSchemeLst/>
 </a:theme>
 </file>
 
@@ -3527,6 +3203,15 @@
 </file>
 
 <file path=customXml/item2.xml><?xml version="1.0" encoding="utf-8"?>
+<?mso-contentType ?>
+<FormTemplates xmlns="http://schemas.microsoft.com/sharepoint/v3/contenttype/forms">
+  <Display>DocumentLibraryForm</Display>
+  <Edit>DocumentLibraryForm</Edit>
+  <New>DocumentLibraryForm</New>
+</FormTemplates>
+</file>
+
+<file path=customXml/item3.xml><?xml version="1.0" encoding="utf-8"?>
 <ct:contentTypeSchema xmlns:ct="http://schemas.microsoft.com/office/2006/metadata/contentType" xmlns:ma="http://schemas.microsoft.com/office/2006/metadata/properties/metaAttributes" ct:_="" ma:_="" ma:contentTypeName="Document" ma:contentTypeID="0x0101003D6D50126296AE48BCFE19E8127FC140" ma:contentTypeVersion="17" ma:contentTypeDescription="Create a new document." ma:contentTypeScope="" ma:versionID="e42a9246f07cbafc6555fed6427091fe">
   <xsd:schema xmlns:xsd="http://www.w3.org/2001/XMLSchema" xmlns:xs="http://www.w3.org/2001/XMLSchema" xmlns:p="http://schemas.microsoft.com/office/2006/metadata/properties" xmlns:ns2="6218c6b5-ce73-4ca6-bf59-4a1731cfc5ff" xmlns:ns3="d89ea556-c3fd-4136-b142-2a0fe0106d4b" xmlns:ns4="7baf63a6-8159-4531-922f-8d695af1915f" targetNamespace="http://schemas.microsoft.com/office/2006/metadata/properties" ma:root="true" ma:fieldsID="a3097466eabda0e3f3ba690da0309b2a" ns2:_="" ns3:_="" ns4:_="">
     <xsd:import namespace="6218c6b5-ce73-4ca6-bf59-4a1731cfc5ff"/>
@@ -3780,15 +3465,6 @@
 </ct:contentTypeSchema>
 </file>
 
-<file path=customXml/item3.xml><?xml version="1.0" encoding="utf-8"?>
-<?mso-contentType ?>
-<FormTemplates xmlns="http://schemas.microsoft.com/sharepoint/v3/contenttype/forms">
-  <Display>DocumentLibraryForm</Display>
-  <Edit>DocumentLibraryForm</Edit>
-  <New>DocumentLibraryForm</New>
-</FormTemplates>
-</file>
-
 <file path=customXml/itemProps1.xml><?xml version="1.0" encoding="utf-8"?>
 <ds:datastoreItem xmlns:ds="http://schemas.openxmlformats.org/officeDocument/2006/customXml" ds:itemID="{1AB718BF-3E27-4F29-B0EB-D862F5C5D80E}">
   <ds:schemaRefs>
@@ -3801,6 +3477,14 @@
 </file>
 
 <file path=customXml/itemProps2.xml><?xml version="1.0" encoding="utf-8"?>
+<ds:datastoreItem xmlns:ds="http://schemas.openxmlformats.org/officeDocument/2006/customXml" ds:itemID="{79075B56-7BD2-4C99-908C-D98602E876B2}">
+  <ds:schemaRefs>
+    <ds:schemaRef ds:uri="http://schemas.microsoft.com/sharepoint/v3/contenttype/forms"/>
+  </ds:schemaRefs>
+</ds:datastoreItem>
+</file>
+
+<file path=customXml/itemProps3.xml><?xml version="1.0" encoding="utf-8"?>
 <ds:datastoreItem xmlns:ds="http://schemas.openxmlformats.org/officeDocument/2006/customXml" ds:itemID="{DEE5614B-6A6F-4B4B-9BDC-A8588B5F748A}">
   <ds:schemaRefs>
     <ds:schemaRef ds:uri="http://schemas.microsoft.com/office/2006/metadata/contentType"/>
@@ -3818,12 +3502,4 @@
     <ds:schemaRef ds:uri="http://schemas.microsoft.com/internal/obd"/>
   </ds:schemaRefs>
 </ds:datastoreItem>
-</file>
-
-<file path=customXml/itemProps3.xml><?xml version="1.0" encoding="utf-8"?>
-<ds:datastoreItem xmlns:ds="http://schemas.openxmlformats.org/officeDocument/2006/customXml" ds:itemID="{79075B56-7BD2-4C99-908C-D98602E876B2}">
-  <ds:schemaRefs>
-    <ds:schemaRef ds:uri="http://schemas.microsoft.com/sharepoint/v3/contenttype/forms"/>
-  </ds:schemaRefs>
-</ds:datastoreItem>
 </file>
</xml_diff>